<commit_message>
Adjust mitigating language for individual
</commit_message>
<xml_diff>
--- a/docs/individual_nda_kb.docx
+++ b/docs/individual_nda_kb.docx
@@ -26,11 +26,11 @@
     </w:p>
     <w:p>
       <w:pPr>
-        <w:pStyle w:val="ListParagraph"/>
         <w:numPr>
           <w:ilvl w:val="0"/>
           <w:numId w:val="10"/>
         </w:numPr>
+        <w:contextualSpacing/>
         <w:rPr>
           <w:b/>
           <w:bCs/>
@@ -57,12 +57,21 @@
     </w:p>
     <w:p>
       <w:r>
-        <w:t>Individual NDA risk exists when an NDA requires Accenture employees, contractors, consultants, representatives, subcontractors, or other personnel to enter into confidentiality obligations directly with the client or counterparty.</w:t>
-      </w:r>
-    </w:p>
-    <w:p>
-      <w:pPr>
-        <w:pStyle w:val="Heading2"/>
+        <w:t xml:space="preserve">Individual NDA risk exists when an NDA requires Accenture employees, contractors, consultants, representatives, subcontractors, or other personnel to </w:t>
+      </w:r>
+      <w:proofErr w:type="gramStart"/>
+      <w:r>
+        <w:t>enter into</w:t>
+      </w:r>
+      <w:proofErr w:type="gramEnd"/>
+      <w:r>
+        <w:t xml:space="preserve"> confidentiality obligations directly with the client or counterparty.</w:t>
+      </w:r>
+    </w:p>
+    <w:p>
+      <w:pPr>
+        <w:keepNext/>
+        <w:keepLines/>
         <w:numPr>
           <w:ilvl w:val="0"/>
           <w:numId w:val="10"/>
@@ -70,11 +79,14 @@
         <w:tabs>
           <w:tab w:val="num" w:pos="360"/>
         </w:tabs>
+        <w:spacing w:before="160" w:after="80"/>
         <w:ind w:left="0" w:firstLine="0"/>
+        <w:outlineLvl w:val="1"/>
         <w:rPr>
           <w:rFonts w:ascii="Aptos" w:eastAsia="Aptos" w:hAnsi="Aptos" w:cs="Aptos"/>
           <w:b/>
           <w:bCs/>
+          <w:color w:val="0F4761" w:themeColor="accent1" w:themeShade="BF"/>
           <w:sz w:val="28"/>
           <w:szCs w:val="28"/>
         </w:rPr>
@@ -84,6 +96,7 @@
           <w:rFonts w:ascii="Aptos" w:eastAsia="Aptos" w:hAnsi="Aptos" w:cs="Aptos"/>
           <w:b/>
           <w:bCs/>
+          <w:color w:val="0F4761" w:themeColor="accent1" w:themeShade="BF"/>
           <w:sz w:val="28"/>
           <w:szCs w:val="28"/>
         </w:rPr>
@@ -100,12 +113,12 @@
     </w:p>
     <w:p>
       <w:pPr>
-        <w:pStyle w:val="ListParagraph"/>
         <w:numPr>
           <w:ilvl w:val="0"/>
           <w:numId w:val="6"/>
         </w:numPr>
         <w:spacing w:after="0"/>
+        <w:contextualSpacing/>
         <w:rPr>
           <w:rFonts w:ascii="Aptos" w:eastAsia="Aptos" w:hAnsi="Aptos" w:cs="Aptos"/>
         </w:rPr>
@@ -119,12 +132,12 @@
     </w:p>
     <w:p>
       <w:pPr>
-        <w:pStyle w:val="ListParagraph"/>
         <w:numPr>
           <w:ilvl w:val="0"/>
           <w:numId w:val="6"/>
         </w:numPr>
         <w:spacing w:after="0"/>
+        <w:contextualSpacing/>
         <w:rPr>
           <w:rFonts w:ascii="Aptos" w:eastAsia="Aptos" w:hAnsi="Aptos" w:cs="Aptos"/>
         </w:rPr>
@@ -138,8 +151,9 @@
     </w:p>
     <w:p>
       <w:pPr>
-        <w:pStyle w:val="ListParagraph"/>
         <w:spacing w:after="0"/>
+        <w:ind w:left="720"/>
+        <w:contextualSpacing/>
         <w:rPr>
           <w:rFonts w:ascii="Aptos" w:eastAsia="Aptos" w:hAnsi="Aptos" w:cs="Aptos"/>
         </w:rPr>
@@ -155,12 +169,12 @@
     </w:p>
     <w:p>
       <w:pPr>
-        <w:pStyle w:val="ListParagraph"/>
         <w:numPr>
           <w:ilvl w:val="0"/>
           <w:numId w:val="5"/>
         </w:numPr>
         <w:spacing w:after="0"/>
+        <w:contextualSpacing/>
         <w:rPr>
           <w:rFonts w:ascii="Aptos" w:eastAsia="Aptos" w:hAnsi="Aptos" w:cs="Aptos"/>
         </w:rPr>
@@ -174,12 +188,12 @@
     </w:p>
     <w:p>
       <w:pPr>
-        <w:pStyle w:val="ListParagraph"/>
         <w:numPr>
           <w:ilvl w:val="0"/>
           <w:numId w:val="5"/>
         </w:numPr>
         <w:spacing w:after="0"/>
+        <w:contextualSpacing/>
         <w:rPr>
           <w:rFonts w:ascii="Aptos" w:eastAsia="Aptos" w:hAnsi="Aptos" w:cs="Aptos"/>
         </w:rPr>
@@ -204,7 +218,8 @@
     </w:p>
     <w:p>
       <w:pPr>
-        <w:pStyle w:val="Heading2"/>
+        <w:keepNext/>
+        <w:keepLines/>
         <w:numPr>
           <w:ilvl w:val="0"/>
           <w:numId w:val="10"/>
@@ -212,11 +227,14 @@
         <w:tabs>
           <w:tab w:val="num" w:pos="360"/>
         </w:tabs>
+        <w:spacing w:before="160" w:after="80"/>
         <w:ind w:left="0" w:firstLine="0"/>
+        <w:outlineLvl w:val="1"/>
         <w:rPr>
           <w:rFonts w:ascii="Aptos" w:eastAsia="Aptos" w:hAnsi="Aptos" w:cs="Aptos"/>
           <w:b/>
           <w:bCs/>
+          <w:color w:val="0F4761" w:themeColor="accent1" w:themeShade="BF"/>
           <w:sz w:val="28"/>
           <w:szCs w:val="28"/>
         </w:rPr>
@@ -226,6 +244,7 @@
           <w:rFonts w:ascii="Aptos" w:eastAsia="Aptos" w:hAnsi="Aptos" w:cs="Aptos"/>
           <w:b/>
           <w:bCs/>
+          <w:color w:val="0F4761" w:themeColor="accent1" w:themeShade="BF"/>
           <w:sz w:val="28"/>
           <w:szCs w:val="28"/>
         </w:rPr>
@@ -234,15 +253,23 @@
     </w:p>
     <w:p>
       <w:pPr>
-        <w:pStyle w:val="Heading3"/>
+        <w:keepNext/>
+        <w:keepLines/>
+        <w:spacing w:before="160" w:after="80"/>
+        <w:outlineLvl w:val="2"/>
+        <w:rPr>
+          <w:rFonts w:eastAsiaTheme="majorEastAsia" w:cstheme="majorBidi"/>
+          <w:color w:val="0F4761" w:themeColor="accent1" w:themeShade="BF"/>
+          <w:sz w:val="28"/>
+          <w:szCs w:val="28"/>
+        </w:rPr>
       </w:pPr>
       <w:r>
         <w:rPr>
           <w:rFonts w:ascii="Aptos" w:eastAsia="Aptos" w:hAnsi="Aptos" w:cs="Aptos"/>
           <w:b/>
           <w:bCs/>
-          <w:sz w:val="24"/>
-          <w:szCs w:val="24"/>
+          <w:color w:val="0F4761" w:themeColor="accent1" w:themeShade="BF"/>
         </w:rPr>
         <w:t>A. Direct Contractual Obligation</w:t>
       </w:r>
@@ -262,12 +289,12 @@
     </w:p>
     <w:p>
       <w:pPr>
-        <w:pStyle w:val="ListParagraph"/>
         <w:numPr>
           <w:ilvl w:val="0"/>
           <w:numId w:val="7"/>
         </w:numPr>
         <w:spacing w:after="0"/>
+        <w:contextualSpacing/>
       </w:pPr>
       <w:r>
         <w:t>Enter into agreements directly with the counterparty; or</w:t>
@@ -275,12 +302,12 @@
     </w:p>
     <w:p>
       <w:pPr>
-        <w:pStyle w:val="ListParagraph"/>
         <w:numPr>
           <w:ilvl w:val="0"/>
           <w:numId w:val="7"/>
         </w:numPr>
         <w:spacing w:after="0"/>
+        <w:contextualSpacing/>
       </w:pPr>
       <w:r>
         <w:t>Provide written undertakings directly to the counterparty.</w:t>
@@ -301,15 +328,23 @@
     </w:p>
     <w:p>
       <w:pPr>
-        <w:pStyle w:val="Heading3"/>
+        <w:keepNext/>
+        <w:keepLines/>
+        <w:spacing w:before="160" w:after="80"/>
+        <w:outlineLvl w:val="2"/>
+        <w:rPr>
+          <w:rFonts w:eastAsiaTheme="majorEastAsia" w:cstheme="majorBidi"/>
+          <w:color w:val="0F4761" w:themeColor="accent1" w:themeShade="BF"/>
+          <w:sz w:val="28"/>
+          <w:szCs w:val="28"/>
+        </w:rPr>
       </w:pPr>
       <w:r>
         <w:rPr>
           <w:rFonts w:ascii="Aptos" w:eastAsia="Aptos" w:hAnsi="Aptos" w:cs="Aptos"/>
           <w:b/>
           <w:bCs/>
-          <w:sz w:val="24"/>
-          <w:szCs w:val="24"/>
+          <w:color w:val="0F4761" w:themeColor="accent1" w:themeShade="BF"/>
         </w:rPr>
         <w:t>B. Separate NDA Requirement</w:t>
       </w:r>
@@ -332,12 +367,12 @@
     </w:p>
     <w:p>
       <w:pPr>
-        <w:pStyle w:val="ListParagraph"/>
         <w:numPr>
           <w:ilvl w:val="0"/>
           <w:numId w:val="8"/>
         </w:numPr>
         <w:spacing w:after="0"/>
+        <w:contextualSpacing/>
       </w:pPr>
       <w:r>
         <w:t>Execution of separate NDAs by Accenture individuals; or</w:t>
@@ -345,12 +380,12 @@
     </w:p>
     <w:p>
       <w:pPr>
-        <w:pStyle w:val="ListParagraph"/>
         <w:numPr>
           <w:ilvl w:val="0"/>
           <w:numId w:val="8"/>
         </w:numPr>
         <w:spacing w:after="0"/>
+        <w:contextualSpacing/>
       </w:pPr>
       <w:r>
         <w:lastRenderedPageBreak/>
@@ -359,15 +394,23 @@
     </w:p>
     <w:p>
       <w:pPr>
-        <w:pStyle w:val="Heading3"/>
+        <w:keepNext/>
+        <w:keepLines/>
+        <w:spacing w:before="160" w:after="80"/>
+        <w:outlineLvl w:val="2"/>
+        <w:rPr>
+          <w:rFonts w:eastAsiaTheme="majorEastAsia" w:cstheme="majorBidi"/>
+          <w:color w:val="0F4761" w:themeColor="accent1" w:themeShade="BF"/>
+          <w:sz w:val="28"/>
+          <w:szCs w:val="28"/>
+        </w:rPr>
       </w:pPr>
       <w:r>
         <w:rPr>
           <w:rFonts w:ascii="Aptos" w:eastAsia="Aptos" w:hAnsi="Aptos" w:cs="Aptos"/>
           <w:b/>
           <w:bCs/>
-          <w:sz w:val="24"/>
-          <w:szCs w:val="24"/>
+          <w:color w:val="0F4761" w:themeColor="accent1" w:themeShade="BF"/>
         </w:rPr>
         <w:t>C. Acceptable Structure</w:t>
       </w:r>
@@ -472,33 +515,69 @@
         <w:rPr>
           <w:rFonts w:ascii="Aptos" w:eastAsia="Aptos" w:hAnsi="Aptos" w:cs="Aptos"/>
         </w:rPr>
-        <w:t>Do NOT trigger Individual NDA where the clause only states that such persons are aware of, informed of, or agree to observe the NDA terms by signing the same agreement, without requiring a separate document directly with the counterparty.</w:t>
-      </w:r>
-    </w:p>
-    <w:p>
-      <w:pPr>
-        <w:rPr>
-          <w:rFonts w:ascii="Aptos" w:eastAsia="Aptos" w:hAnsi="Aptos" w:cs="Aptos"/>
-        </w:rPr>
-      </w:pPr>
-      <w:r>
-        <w:rPr>
-          <w:rFonts w:ascii="Aptos" w:eastAsia="Aptos" w:hAnsi="Aptos" w:cs="Aptos"/>
-        </w:rPr>
-        <w:t>Do NOT trigger Individual NDA where the clause contains acknowledgement, conformity, consent, or signature language, but the same clause confirms that the Receiving Party / Recipient / Provider remains responsible for the conduct or breach of those persons.</w:t>
-      </w:r>
-    </w:p>
-    <w:p>
-      <w:pPr>
-        <w:pStyle w:val="Heading3"/>
+        <w:t xml:space="preserve">Do NOT trigger Individual NDA where the clause only states that such </w:t>
+      </w:r>
+      <w:proofErr w:type="gramStart"/>
+      <w:r>
+        <w:rPr>
+          <w:rFonts w:ascii="Aptos" w:eastAsia="Aptos" w:hAnsi="Aptos" w:cs="Aptos"/>
+        </w:rPr>
+        <w:t>persons</w:t>
+      </w:r>
+      <w:proofErr w:type="gramEnd"/>
+      <w:r>
+        <w:rPr>
+          <w:rFonts w:ascii="Aptos" w:eastAsia="Aptos" w:hAnsi="Aptos" w:cs="Aptos"/>
+        </w:rPr>
+        <w:t xml:space="preserve"> are aware of, informed of, or agree to observe the NDA terms by signing the same agreement, without requiring a separate document directly with the counterparty.</w:t>
+      </w:r>
+    </w:p>
+    <w:p>
+      <w:pPr>
+        <w:rPr>
+          <w:rFonts w:ascii="Aptos" w:eastAsia="Aptos" w:hAnsi="Aptos" w:cs="Aptos"/>
+        </w:rPr>
+      </w:pPr>
+      <w:r>
+        <w:rPr>
+          <w:rFonts w:ascii="Aptos" w:eastAsia="Aptos" w:hAnsi="Aptos" w:cs="Aptos"/>
+        </w:rPr>
+        <w:t xml:space="preserve">Do NOT trigger Individual NDA where the clause contains acknowledgement, conformity, consent, or signature language, but the same clause confirms that the Receiving Party / Recipient / Provider remains responsible for the conduct or breach of those </w:t>
+      </w:r>
+      <w:proofErr w:type="gramStart"/>
+      <w:r>
+        <w:rPr>
+          <w:rFonts w:ascii="Aptos" w:eastAsia="Aptos" w:hAnsi="Aptos" w:cs="Aptos"/>
+        </w:rPr>
+        <w:t>persons</w:t>
+      </w:r>
+      <w:proofErr w:type="gramEnd"/>
+      <w:r>
+        <w:rPr>
+          <w:rFonts w:ascii="Aptos" w:eastAsia="Aptos" w:hAnsi="Aptos" w:cs="Aptos"/>
+        </w:rPr>
+        <w:t>.</w:t>
+      </w:r>
+    </w:p>
+    <w:p>
+      <w:pPr>
+        <w:keepNext/>
+        <w:keepLines/>
+        <w:spacing w:before="160" w:after="80"/>
+        <w:outlineLvl w:val="2"/>
+        <w:rPr>
+          <w:rFonts w:eastAsiaTheme="majorEastAsia" w:cstheme="majorBidi"/>
+          <w:color w:val="0F4761" w:themeColor="accent1" w:themeShade="BF"/>
+          <w:sz w:val="28"/>
+          <w:szCs w:val="28"/>
+        </w:rPr>
       </w:pPr>
       <w:r>
         <w:rPr>
           <w:rFonts w:ascii="Aptos" w:eastAsia="Aptos" w:hAnsi="Aptos" w:cs="Aptos"/>
           <w:b/>
           <w:bCs/>
-          <w:sz w:val="24"/>
-          <w:szCs w:val="24"/>
+          <w:color w:val="0F4761" w:themeColor="accent1" w:themeShade="BF"/>
         </w:rPr>
         <w:t>D. Internal Obligations</w:t>
       </w:r>
@@ -521,7 +600,8 @@
     </w:p>
     <w:p>
       <w:pPr>
-        <w:pStyle w:val="Heading2"/>
+        <w:keepNext/>
+        <w:keepLines/>
         <w:numPr>
           <w:ilvl w:val="0"/>
           <w:numId w:val="10"/>
@@ -529,11 +609,14 @@
         <w:tabs>
           <w:tab w:val="num" w:pos="360"/>
         </w:tabs>
+        <w:spacing w:before="160" w:after="80"/>
         <w:ind w:left="0" w:firstLine="0"/>
+        <w:outlineLvl w:val="1"/>
         <w:rPr>
           <w:rFonts w:ascii="Aptos" w:eastAsia="Aptos" w:hAnsi="Aptos" w:cs="Aptos"/>
           <w:b/>
           <w:bCs/>
+          <w:color w:val="0F4761" w:themeColor="accent1" w:themeShade="BF"/>
           <w:sz w:val="28"/>
           <w:szCs w:val="28"/>
         </w:rPr>
@@ -543,6 +626,7 @@
           <w:rFonts w:ascii="Aptos" w:eastAsia="Aptos" w:hAnsi="Aptos" w:cs="Aptos"/>
           <w:b/>
           <w:bCs/>
+          <w:color w:val="0F4761" w:themeColor="accent1" w:themeShade="BF"/>
           <w:sz w:val="28"/>
           <w:szCs w:val="28"/>
         </w:rPr>
@@ -555,11 +639,19 @@
           <w:rFonts w:ascii="Aptos" w:eastAsia="Aptos" w:hAnsi="Aptos" w:cs="Aptos"/>
         </w:rPr>
       </w:pPr>
-      <w:r>
-        <w:rPr>
-          <w:rFonts w:ascii="Aptos" w:eastAsia="Aptos" w:hAnsi="Aptos" w:cs="Aptos"/>
-        </w:rPr>
-        <w:t>Individual NDA Risk is present only where personnel are required to enter confidentiality obligations directly with the counterparty.</w:t>
+      <w:proofErr w:type="gramStart"/>
+      <w:r>
+        <w:rPr>
+          <w:rFonts w:ascii="Aptos" w:eastAsia="Aptos" w:hAnsi="Aptos" w:cs="Aptos"/>
+        </w:rPr>
+        <w:t>Individual NDA Risk</w:t>
+      </w:r>
+      <w:proofErr w:type="gramEnd"/>
+      <w:r>
+        <w:rPr>
+          <w:rFonts w:ascii="Aptos" w:eastAsia="Aptos" w:hAnsi="Aptos" w:cs="Aptos"/>
+        </w:rPr>
+        <w:t xml:space="preserve"> is present only where personnel are required to enter confidentiality obligations directly with the counterparty.</w:t>
       </w:r>
     </w:p>
     <w:p>
@@ -591,7 +683,15 @@
     </w:p>
     <w:p>
       <w:r>
-        <w:t>A same-document acknowledgement, conformity statement, or signature block by Authorized Recipients or similar persons does not by itself create Individual NDA Risk. The agent must confirm that the clause requires a separate NDA, separate undertaking, separate acknowledgement letter, separate written agreement, or direct delivery of such document to the counterparty before triggering Individual NDA.</w:t>
+        <w:t xml:space="preserve">A </w:t>
+      </w:r>
+      <w:proofErr w:type="gramStart"/>
+      <w:r>
+        <w:t>same-document</w:t>
+      </w:r>
+      <w:proofErr w:type="gramEnd"/>
+      <w:r>
+        <w:t xml:space="preserve"> acknowledgement, conformity statement, or signature block by Authorized Recipients or similar persons does not by itself create Individual NDA Risk. The agent must confirm that the clause requires a separate NDA, separate undertaking, separate acknowledgement letter, separate written agreement, or direct delivery of such document to the counterparty before triggering Individual NDA.</w:t>
       </w:r>
     </w:p>
     <w:p>
@@ -602,41 +702,31 @@
           <w:numId w:val="10"/>
         </w:numPr>
         <w:rPr>
+          <w:color w:val="153D63"/>
+        </w:rPr>
+      </w:pPr>
+      <w:r>
+        <w:rPr>
           <w:b/>
           <w:bCs/>
-          <w:color w:val="153D63" w:themeColor="text2" w:themeTint="E6"/>
+          <w:color w:val="153D63"/>
           <w:sz w:val="28"/>
           <w:szCs w:val="28"/>
         </w:rPr>
-      </w:pPr>
-      <w:r>
-        <w:rPr>
-          <w:b/>
-          <w:bCs/>
-          <w:color w:val="153D63" w:themeColor="text2" w:themeTint="E6"/>
-          <w:sz w:val="28"/>
-          <w:szCs w:val="28"/>
-        </w:rPr>
-        <w:t>Mitigation Language Guidance</w:t>
-      </w:r>
-    </w:p>
-    <w:p>
-      <w:pPr>
-        <w:rPr>
-          <w:color w:val="000000" w:themeColor="text1"/>
-        </w:rPr>
-      </w:pPr>
-      <w:r>
-        <w:rPr>
-          <w:rFonts w:ascii="Aptos" w:eastAsia="Aptos" w:hAnsi="Aptos" w:cs="Aptos"/>
-        </w:rPr>
-        <w:t xml:space="preserve">Delete the clause or propose the following language: </w:t>
-      </w:r>
-      <w:r>
-        <w:rPr>
-          <w:color w:val="000000" w:themeColor="text1"/>
-        </w:rPr>
-        <w:t>If the counterparty requires additional confirmation, the following language may be proposed:</w:t>
+        <w:t>APPROVED STATIC MITIGATION LANGUAGE</w:t>
+      </w:r>
+    </w:p>
+    <w:p>
+      <w:r>
+        <w:t xml:space="preserve">When Individual NDA Risk is triggered, </w:t>
+      </w:r>
+      <w:proofErr w:type="spellStart"/>
+      <w:r>
+        <w:t>mitigating_language</w:t>
+      </w:r>
+      <w:proofErr w:type="spellEnd"/>
+      <w:r>
+        <w:t xml:space="preserve"> MUST use the following approved static text exactly:</w:t>
       </w:r>
     </w:p>
     <w:p>
@@ -648,16 +738,57 @@
           <w:rFonts w:ascii="Courier New" w:hAnsi="Courier New" w:cs="Courier New"/>
           <w:color w:val="000000" w:themeColor="text1"/>
         </w:rPr>
-        <w:t>Delete the clause or reword as needed to propose the following or similar language: "Accenture will ensure that all personnel who will have access to the Confidential Information will sign an acknowledgement with Accenture, stating that they are bound to comply with the terms of this NDA.</w:t>
-      </w:r>
-    </w:p>
-    <w:p>
-      <w:pPr>
-        <w:pStyle w:val="ListParagraph"/>
+        <w:t xml:space="preserve">Delete the clause or reword as needed to propose the following or similar language: </w:t>
+      </w:r>
+      <w:r>
+        <w:rPr>
+          <w:rFonts w:ascii="Courier New" w:hAnsi="Courier New" w:cs="Courier New"/>
+          <w:color w:val="000000"/>
+        </w:rPr>
+        <w:t>“</w:t>
+      </w:r>
+      <w:r>
+        <w:rPr>
+          <w:rFonts w:ascii="Courier New" w:hAnsi="Courier New" w:cs="Courier New"/>
+          <w:color w:val="000000" w:themeColor="text1"/>
+        </w:rPr>
+        <w:t>Accenture will ensure that all personnel who will have access to the Confidential Information will sign an acknowledgement with Accenture, stating that they are bound to comply with the terms of this NDA</w:t>
+      </w:r>
+      <w:r>
+        <w:rPr>
+          <w:rFonts w:ascii="Courier New" w:hAnsi="Courier New" w:cs="Courier New"/>
+          <w:color w:val="000000"/>
+        </w:rPr>
+        <w:t>.”</w:t>
+      </w:r>
+    </w:p>
+    <w:p>
+      <w:r>
+        <w:t>The complete sentence above is the Individual NDA Mitigation Language.</w:t>
+      </w:r>
+    </w:p>
+    <w:p>
+      <w:r>
+        <w:t>The wording beginning with “Delete the clause or reword as needed” is mandatory and MUST NOT be omitted.</w:t>
+      </w:r>
+    </w:p>
+    <w:p>
+      <w:r>
+        <w:t>Do NOT return only the quoted replacement language.</w:t>
+      </w:r>
+    </w:p>
+    <w:p>
+      <w:r>
+        <w:t>Do NOT summarize, shorten, paraphrase, or partially reproduce the approved mitigation language.</w:t>
+      </w:r>
+    </w:p>
+    <w:p>
+      <w:pPr>
         <w:numPr>
           <w:ilvl w:val="0"/>
           <w:numId w:val="1"/>
         </w:numPr>
+        <w:contextualSpacing/>
         <w:rPr>
           <w:rFonts w:eastAsiaTheme="minorEastAsia"/>
           <w:b/>
@@ -681,8 +812,8 @@
     </w:p>
     <w:p>
       <w:pPr>
-        <w:pStyle w:val="ListParagraph"/>
-        <w:ind w:hanging="360"/>
+        <w:ind w:left="720" w:hanging="360"/>
+        <w:contextualSpacing/>
         <w:rPr>
           <w:rFonts w:ascii="Courier New" w:hAnsi="Courier New" w:cs="Courier New"/>
           <w:color w:val="000000" w:themeColor="text1"/>
@@ -691,53 +822,47 @@
     </w:p>
     <w:p>
       <w:pPr>
-        <w:pStyle w:val="ListParagraph"/>
+        <w:ind w:left="720"/>
+        <w:contextualSpacing/>
       </w:pPr>
       <w:r>
         <w:t>When Individual NDA Risk is triggered, the risk description shown on screen must use the following text:</w:t>
       </w:r>
     </w:p>
-    <w:p/>
-    <w:p>
-      <w:pPr>
-        <w:pStyle w:val="ListParagraph"/>
-        <w:ind w:hanging="360"/>
+    <w:p>
+      <w:pPr>
+        <w:ind w:left="720"/>
+        <w:contextualSpacing/>
+      </w:pPr>
+    </w:p>
+    <w:p>
+      <w:pPr>
+        <w:ind w:left="720" w:hanging="360"/>
+        <w:contextualSpacing/>
       </w:pPr>
       <w:r>
         <w:rPr>
           <w:rFonts w:ascii="Courier New" w:eastAsia="Courier New" w:hAnsi="Courier New" w:cs="Courier New"/>
         </w:rPr>
-        <w:t xml:space="preserve">  </w:t>
-      </w:r>
-      <w:r>
+        <w:t xml:space="preserve">   This NDA has been identified as having a provision that requires Accenture employees and representatives to sign in their capacity as individuals an NDA directly with the Client, which exposes such individuals to direct liability to the Client.</w:t>
+      </w:r>
+    </w:p>
+    <w:p>
+      <w:pPr>
+        <w:ind w:left="720" w:hanging="360"/>
+        <w:contextualSpacing/>
         <w:rPr>
           <w:rFonts w:ascii="Courier New" w:eastAsia="Courier New" w:hAnsi="Courier New" w:cs="Courier New"/>
         </w:rPr>
-        <w:t xml:space="preserve"> </w:t>
-      </w:r>
-      <w:r>
-        <w:rPr>
-          <w:rFonts w:ascii="Courier New" w:eastAsia="Courier New" w:hAnsi="Courier New" w:cs="Courier New"/>
-        </w:rPr>
-        <w:t>This NDA has been identified as having a provision that requires Accenture employees and representatives to sign in their capacity as individuals an NDA directly with the Client, which exposes such individuals to direct liability to the Client</w:t>
-      </w:r>
-    </w:p>
-    <w:p>
-      <w:pPr>
-        <w:pStyle w:val="ListParagraph"/>
-        <w:ind w:hanging="360"/>
-        <w:rPr>
-          <w:rFonts w:ascii="Courier New" w:eastAsia="Courier New" w:hAnsi="Courier New" w:cs="Courier New"/>
-        </w:rPr>
-      </w:pPr>
-    </w:p>
-    <w:p>
-      <w:pPr>
-        <w:pStyle w:val="ListParagraph"/>
+      </w:pPr>
+    </w:p>
+    <w:p>
+      <w:pPr>
         <w:numPr>
           <w:ilvl w:val="0"/>
           <w:numId w:val="10"/>
         </w:numPr>
+        <w:contextualSpacing/>
         <w:rPr>
           <w:b/>
           <w:bCs/>
@@ -754,6 +879,7 @@
           <w:sz w:val="28"/>
           <w:szCs w:val="28"/>
         </w:rPr>
+        <w:lastRenderedPageBreak/>
         <w:t>Playbook Examples (FOR REFERENCE ONLY)</w:t>
       </w:r>
     </w:p>
@@ -764,7 +890,15 @@
     </w:p>
     <w:p>
       <w:r>
-        <w:t>Always evaluate whether personnel are required to enter into obligations directly with the counterparty.</w:t>
+        <w:t xml:space="preserve">Always evaluate whether personnel are required to </w:t>
+      </w:r>
+      <w:proofErr w:type="gramStart"/>
+      <w:r>
+        <w:t>enter into</w:t>
+      </w:r>
+      <w:proofErr w:type="gramEnd"/>
+      <w:r>
+        <w:t xml:space="preserve"> obligations directly with the counterparty.</w:t>
       </w:r>
     </w:p>
     <w:p>
@@ -804,6 +938,7 @@
           </w:tcPr>
           <w:p>
             <w:pPr>
+              <w:spacing w:after="160" w:line="278" w:lineRule="auto"/>
               <w:rPr>
                 <w:b/>
                 <w:bCs/>
@@ -818,7 +953,6 @@
                 <w:sz w:val="22"/>
                 <w:szCs w:val="22"/>
               </w:rPr>
-              <w:lastRenderedPageBreak/>
               <w:t>Example Contract Language</w:t>
             </w:r>
           </w:p>
@@ -829,6 +963,7 @@
           </w:tcPr>
           <w:p>
             <w:pPr>
+              <w:spacing w:after="160" w:line="278" w:lineRule="auto"/>
               <w:rPr>
                 <w:b/>
                 <w:bCs/>
@@ -855,6 +990,7 @@
           </w:tcPr>
           <w:p>
             <w:pPr>
+              <w:spacing w:after="160" w:line="278" w:lineRule="auto"/>
               <w:rPr>
                 <w:sz w:val="22"/>
                 <w:szCs w:val="22"/>
@@ -892,6 +1028,7 @@
           </w:tcPr>
           <w:p>
             <w:pPr>
+              <w:spacing w:after="160" w:line="278" w:lineRule="auto"/>
               <w:jc w:val="center"/>
               <w:rPr>
                 <w:sz w:val="22"/>
@@ -903,7 +1040,39 @@
                 <w:sz w:val="22"/>
                 <w:szCs w:val="22"/>
               </w:rPr>
-              <w:t>We can procure compliance without need to have people sign individual NDA’s. Acceptable provision</w:t>
+              <w:t xml:space="preserve">We can procure compliance without </w:t>
+            </w:r>
+            <w:proofErr w:type="gramStart"/>
+            <w:r>
+              <w:rPr>
+                <w:sz w:val="22"/>
+                <w:szCs w:val="22"/>
+              </w:rPr>
+              <w:t>need</w:t>
+            </w:r>
+            <w:proofErr w:type="gramEnd"/>
+            <w:r>
+              <w:rPr>
+                <w:sz w:val="22"/>
+                <w:szCs w:val="22"/>
+              </w:rPr>
+              <w:t xml:space="preserve"> to have people sign individual </w:t>
+            </w:r>
+            <w:proofErr w:type="gramStart"/>
+            <w:r>
+              <w:rPr>
+                <w:sz w:val="22"/>
+                <w:szCs w:val="22"/>
+              </w:rPr>
+              <w:t>NDA’s</w:t>
+            </w:r>
+            <w:proofErr w:type="gramEnd"/>
+            <w:r>
+              <w:rPr>
+                <w:sz w:val="22"/>
+                <w:szCs w:val="22"/>
+              </w:rPr>
+              <w:t>. Acceptable provision</w:t>
             </w:r>
           </w:p>
         </w:tc>
@@ -915,6 +1084,7 @@
           </w:tcPr>
           <w:p>
             <w:pPr>
+              <w:spacing w:after="160" w:line="278" w:lineRule="auto"/>
               <w:rPr>
                 <w:sz w:val="22"/>
                 <w:szCs w:val="22"/>
@@ -952,6 +1122,7 @@
           </w:tcPr>
           <w:p>
             <w:pPr>
+              <w:spacing w:after="160" w:line="278" w:lineRule="auto"/>
               <w:jc w:val="center"/>
               <w:rPr>
                 <w:sz w:val="22"/>
@@ -975,6 +1146,7 @@
           </w:tcPr>
           <w:p>
             <w:pPr>
+              <w:spacing w:after="160" w:line="278" w:lineRule="auto"/>
               <w:rPr>
                 <w:sz w:val="22"/>
                 <w:szCs w:val="22"/>
@@ -994,7 +1166,27 @@
                 <w:sz w:val="22"/>
                 <w:szCs w:val="22"/>
               </w:rPr>
-              <w:t>Recipient's Representatives acting for the sole benefit of Recipient, who have a need to know, are under a duty of non-disclosure with respect to such information, and are under a duty to implement appropriate measures to maintain the confidentiality, security and integrity of such information.</w:t>
+              <w:t xml:space="preserve">Recipient's Representatives acting for the sole benefit of Recipient, who have a need to know, are under a duty of non-disclosure with respect to such </w:t>
+            </w:r>
+            <w:proofErr w:type="gramStart"/>
+            <w:r>
+              <w:rPr>
+                <w:i/>
+                <w:iCs/>
+                <w:sz w:val="22"/>
+                <w:szCs w:val="22"/>
+              </w:rPr>
+              <w:t>information, and</w:t>
+            </w:r>
+            <w:proofErr w:type="gramEnd"/>
+            <w:r>
+              <w:rPr>
+                <w:i/>
+                <w:iCs/>
+                <w:sz w:val="22"/>
+                <w:szCs w:val="22"/>
+              </w:rPr>
+              <w:t xml:space="preserve"> are under a duty to implement appropriate measures to maintain the confidentiality, security and integrity of such information.</w:t>
             </w:r>
             <w:r>
               <w:rPr>
@@ -1013,6 +1205,7 @@
           </w:tcPr>
           <w:p>
             <w:pPr>
+              <w:spacing w:after="160" w:line="278" w:lineRule="auto"/>
               <w:jc w:val="center"/>
               <w:rPr>
                 <w:sz w:val="22"/>
@@ -1036,6 +1229,7 @@
           </w:tcPr>
           <w:p>
             <w:pPr>
+              <w:spacing w:after="160" w:line="278" w:lineRule="auto"/>
               <w:rPr>
                 <w:sz w:val="22"/>
                 <w:szCs w:val="22"/>
@@ -1074,6 +1268,7 @@
           </w:tcPr>
           <w:p>
             <w:pPr>
+              <w:spacing w:after="160" w:line="278" w:lineRule="auto"/>
               <w:jc w:val="center"/>
             </w:pPr>
           </w:p>
@@ -1086,6 +1281,7 @@
           </w:tcPr>
           <w:p>
             <w:pPr>
+              <w:spacing w:after="160" w:line="278" w:lineRule="auto"/>
               <w:rPr>
                 <w:sz w:val="22"/>
                 <w:szCs w:val="22"/>
@@ -1123,7 +1319,7 @@
           </w:tcPr>
           <w:p>
             <w:pPr>
-              <w:spacing w:before="120" w:after="120"/>
+              <w:spacing w:before="120" w:after="120" w:line="278" w:lineRule="auto"/>
               <w:jc w:val="center"/>
               <w:rPr>
                 <w:rFonts w:eastAsiaTheme="minorEastAsia"/>
@@ -1148,7 +1344,7 @@
           </w:p>
           <w:p>
             <w:pPr>
-              <w:spacing w:before="120" w:after="120"/>
+              <w:spacing w:before="120" w:after="120" w:line="278" w:lineRule="auto"/>
               <w:jc w:val="center"/>
               <w:rPr>
                 <w:rFonts w:eastAsiaTheme="minorEastAsia"/>
@@ -1162,7 +1358,7 @@
           </w:p>
           <w:p>
             <w:pPr>
-              <w:spacing w:before="120" w:after="120"/>
+              <w:spacing w:before="120" w:after="120" w:line="278" w:lineRule="auto"/>
               <w:jc w:val="center"/>
               <w:rPr>
                 <w:rFonts w:eastAsiaTheme="minorEastAsia"/>
@@ -1176,6 +1372,7 @@
           </w:p>
           <w:p>
             <w:pPr>
+              <w:spacing w:after="160" w:line="278" w:lineRule="auto"/>
               <w:jc w:val="center"/>
               <w:rPr>
                 <w:sz w:val="22"/>
@@ -1192,6 +1389,7 @@
           </w:tcPr>
           <w:p>
             <w:pPr>
+              <w:spacing w:after="160" w:line="278" w:lineRule="auto"/>
               <w:rPr>
                 <w:sz w:val="22"/>
                 <w:szCs w:val="22"/>
@@ -1202,6 +1400,7 @@
                 <w:sz w:val="22"/>
                 <w:szCs w:val="22"/>
               </w:rPr>
+              <w:lastRenderedPageBreak/>
               <w:t>“</w:t>
             </w:r>
             <w:r>
@@ -1229,6 +1428,7 @@
           </w:tcPr>
           <w:p>
             <w:pPr>
+              <w:spacing w:after="160" w:line="278" w:lineRule="auto"/>
               <w:jc w:val="center"/>
               <w:rPr>
                 <w:sz w:val="22"/>
@@ -1252,6 +1452,7 @@
           </w:tcPr>
           <w:p>
             <w:pPr>
+              <w:spacing w:after="160" w:line="278" w:lineRule="auto"/>
               <w:rPr>
                 <w:sz w:val="22"/>
                 <w:szCs w:val="22"/>
@@ -1289,6 +1490,7 @@
           </w:tcPr>
           <w:p>
             <w:pPr>
+              <w:spacing w:after="160" w:line="278" w:lineRule="auto"/>
               <w:jc w:val="center"/>
               <w:rPr>
                 <w:sz w:val="22"/>
@@ -1312,6 +1514,7 @@
           </w:tcPr>
           <w:p>
             <w:pPr>
+              <w:spacing w:after="160" w:line="278" w:lineRule="auto"/>
               <w:rPr>
                 <w:sz w:val="22"/>
                 <w:szCs w:val="22"/>
@@ -1331,17 +1534,7 @@
                 <w:sz w:val="22"/>
                 <w:szCs w:val="22"/>
               </w:rPr>
-              <w:t xml:space="preserve">… to keep the Confidential Information confidential, to use the Confidential Information only in connection with the Project, not to use the Confidential Information after the termination of the Project for any reason, including completion thereof and not to disclose any Confidential Information to any Person (other than employees, </w:t>
-            </w:r>
-            <w:r>
-              <w:rPr>
-                <w:i/>
-                <w:iCs/>
-                <w:sz w:val="22"/>
-                <w:szCs w:val="22"/>
-              </w:rPr>
-              <w:lastRenderedPageBreak/>
-              <w:t>affiliates, agents, representatives and advisors of the Recipient who need to know such Confidential Information and who have previously agreed, either as a condition of employment or in order to obtain the Confidential Information, to be bound by terms and conditions substantially similar to those of this agreement), in any manner whatsoever, in whole or in part;</w:t>
+              <w:t>… to keep the Confidential Information confidential, to use the Confidential Information only in connection with the Project, not to use the Confidential Information after the termination of the Project for any reason, including completion thereof and not to disclose any Confidential Information to any Person (other than employees, affiliates, agents, representatives and advisors of the Recipient who need to know such Confidential Information and who have previously agreed, either as a condition of employment or in order to obtain the Confidential Information, to be bound by terms and conditions substantially similar to those of this agreement), in any manner whatsoever, in whole or in part;</w:t>
             </w:r>
             <w:r>
               <w:rPr>
@@ -1359,6 +1552,7 @@
           </w:tcPr>
           <w:p>
             <w:pPr>
+              <w:spacing w:after="160" w:line="278" w:lineRule="auto"/>
               <w:jc w:val="center"/>
               <w:rPr>
                 <w:sz w:val="22"/>
@@ -1370,7 +1564,6 @@
                 <w:sz w:val="22"/>
                 <w:szCs w:val="22"/>
               </w:rPr>
-              <w:lastRenderedPageBreak/>
               <w:t>This provision can be accepted as it does not imply that any individual NDA will have to be signed.</w:t>
             </w:r>
           </w:p>
@@ -1383,6 +1576,7 @@
           </w:tcPr>
           <w:p>
             <w:pPr>
+              <w:spacing w:after="160" w:line="278" w:lineRule="auto"/>
               <w:rPr>
                 <w:sz w:val="22"/>
                 <w:szCs w:val="22"/>
@@ -1420,6 +1614,7 @@
           </w:tcPr>
           <w:p>
             <w:pPr>
+              <w:spacing w:after="160" w:line="278" w:lineRule="auto"/>
               <w:jc w:val="center"/>
               <w:rPr>
                 <w:sz w:val="22"/>
@@ -1443,6 +1638,7 @@
           </w:tcPr>
           <w:p>
             <w:pPr>
+              <w:spacing w:after="160" w:line="278" w:lineRule="auto"/>
               <w:rPr>
                 <w:sz w:val="22"/>
                 <w:szCs w:val="22"/>
@@ -1533,6 +1729,7 @@
           </w:tcPr>
           <w:p>
             <w:pPr>
+              <w:spacing w:after="160" w:line="278" w:lineRule="auto"/>
               <w:jc w:val="center"/>
               <w:rPr>
                 <w:sz w:val="22"/>
@@ -1556,6 +1753,7 @@
           </w:tcPr>
           <w:p>
             <w:pPr>
+              <w:spacing w:after="160" w:line="278" w:lineRule="auto"/>
               <w:rPr>
                 <w:sz w:val="22"/>
                 <w:szCs w:val="22"/>
@@ -1566,6 +1764,7 @@
                 <w:sz w:val="22"/>
                 <w:szCs w:val="22"/>
               </w:rPr>
+              <w:lastRenderedPageBreak/>
               <w:t>“</w:t>
             </w:r>
             <w:r>
@@ -1593,6 +1792,7 @@
           </w:tcPr>
           <w:p>
             <w:pPr>
+              <w:spacing w:after="160" w:line="278" w:lineRule="auto"/>
               <w:jc w:val="center"/>
               <w:rPr>
                 <w:sz w:val="22"/>
@@ -1616,6 +1816,7 @@
           </w:tcPr>
           <w:p>
             <w:pPr>
+              <w:spacing w:after="160" w:line="278" w:lineRule="auto"/>
               <w:rPr>
                 <w:sz w:val="22"/>
                 <w:szCs w:val="22"/>
@@ -1653,6 +1854,7 @@
           </w:tcPr>
           <w:p>
             <w:pPr>
+              <w:spacing w:after="160" w:line="278" w:lineRule="auto"/>
               <w:jc w:val="center"/>
               <w:rPr>
                 <w:sz w:val="22"/>
@@ -1676,6 +1878,7 @@
           </w:tcPr>
           <w:p>
             <w:pPr>
+              <w:spacing w:after="160" w:line="278" w:lineRule="auto"/>
               <w:rPr>
                 <w:sz w:val="22"/>
                 <w:szCs w:val="22"/>
@@ -1713,6 +1916,7 @@
           </w:tcPr>
           <w:p>
             <w:pPr>
+              <w:spacing w:after="160" w:line="278" w:lineRule="auto"/>
               <w:jc w:val="center"/>
               <w:rPr>
                 <w:sz w:val="22"/>
@@ -1742,6 +1946,9 @@
             <w:hideMark/>
           </w:tcPr>
           <w:p>
+            <w:pPr>
+              <w:spacing w:after="160" w:line="278" w:lineRule="auto"/>
+            </w:pPr>
             <w:r>
               <w:rPr>
                 <w:sz w:val="22"/>
@@ -1781,6 +1988,7 @@
           </w:tcPr>
           <w:p>
             <w:pPr>
+              <w:spacing w:after="160" w:line="278" w:lineRule="auto"/>
               <w:jc w:val="center"/>
             </w:pPr>
             <w:r>
@@ -1806,12 +2014,14 @@
             <w:hideMark/>
           </w:tcPr>
           <w:p>
-            <w:r>
-              <w:rPr>
-                <w:sz w:val="22"/>
-                <w:szCs w:val="22"/>
-              </w:rPr>
-              <w:lastRenderedPageBreak/>
+            <w:pPr>
+              <w:spacing w:after="160" w:line="278" w:lineRule="auto"/>
+            </w:pPr>
+            <w:r>
+              <w:rPr>
+                <w:sz w:val="22"/>
+                <w:szCs w:val="22"/>
+              </w:rPr>
               <w:t>“</w:t>
             </w:r>
             <w:r>
@@ -1846,6 +2056,7 @@
           </w:tcPr>
           <w:p>
             <w:pPr>
+              <w:spacing w:after="160" w:line="278" w:lineRule="auto"/>
               <w:jc w:val="center"/>
             </w:pPr>
             <w:r>
@@ -1909,9 +2120,8 @@
           </w:tcPr>
           <w:p>
             <w:pPr>
-              <w:pStyle w:val="NormalWeb"/>
               <w:shd w:val="clear" w:color="auto" w:fill="FFFFFF" w:themeFill="background1"/>
-              <w:spacing w:beforeAutospacing="1" w:afterAutospacing="1" w:line="338" w:lineRule="atLeast"/>
+              <w:spacing w:beforeAutospacing="1" w:after="160" w:afterAutospacing="1" w:line="338" w:lineRule="atLeast"/>
               <w:ind w:right="2018"/>
               <w:jc w:val="both"/>
               <w:rPr>
@@ -1941,9 +2151,8 @@
           </w:tcPr>
           <w:p>
             <w:pPr>
-              <w:pStyle w:val="NormalWeb"/>
               <w:shd w:val="clear" w:color="auto" w:fill="FFFFFF" w:themeFill="background1"/>
-              <w:spacing w:beforeAutospacing="1" w:afterAutospacing="1" w:line="338" w:lineRule="atLeast"/>
+              <w:spacing w:beforeAutospacing="1" w:after="160" w:afterAutospacing="1" w:line="338" w:lineRule="atLeast"/>
               <w:ind w:right="2018"/>
               <w:jc w:val="both"/>
               <w:rPr>
@@ -1981,7 +2190,7 @@
               <w:tabs>
                 <w:tab w:val="left" w:pos="1241"/>
               </w:tabs>
-              <w:spacing w:before="120" w:after="120"/>
+              <w:spacing w:before="120" w:after="120" w:line="278" w:lineRule="auto"/>
               <w:jc w:val="both"/>
               <w:rPr>
                 <w:sz w:val="22"/>
@@ -2006,7 +2215,19 @@
                 <w:sz w:val="22"/>
                 <w:szCs w:val="22"/>
               </w:rPr>
-              <w:t>The Disclosing Party may, at its absolute discretion, at any time require the Receiving Party to arrange for any or all of the Receiving Party's Representatives to give a written undertaking to the Disclosing Party that they have been advised of the confidential nature of the Confidential Information, their obligations with respect to such Confidential Information.</w:t>
+              <w:t xml:space="preserve">The Disclosing Party may, at its absolute discretion, at any time require the Receiving Party to arrange for any or all of the Receiving Party's Representatives to give a written undertaking to the Disclosing Party that </w:t>
+            </w:r>
+            <w:r>
+              <w:rPr>
+                <w:rFonts w:ascii="Aptos" w:eastAsia="Aptos" w:hAnsi="Aptos" w:cs="Aptos"/>
+                <w:i/>
+                <w:iCs/>
+                <w:color w:val="000000" w:themeColor="text1"/>
+                <w:sz w:val="22"/>
+                <w:szCs w:val="22"/>
+              </w:rPr>
+              <w:lastRenderedPageBreak/>
+              <w:t>they have been advised of the confidential nature of the Confidential Information, their obligations with respect to such Confidential Information.</w:t>
             </w:r>
             <w:r>
               <w:rPr>
@@ -2020,9 +2241,8 @@
           </w:p>
           <w:p>
             <w:pPr>
-              <w:pStyle w:val="NormalWeb"/>
               <w:shd w:val="clear" w:color="auto" w:fill="FFFFFF" w:themeFill="background1"/>
-              <w:spacing w:beforeAutospacing="1" w:afterAutospacing="1" w:line="338" w:lineRule="atLeast"/>
+              <w:spacing w:beforeAutospacing="1" w:after="160" w:afterAutospacing="1" w:line="338" w:lineRule="atLeast"/>
               <w:jc w:val="both"/>
               <w:rPr>
                 <w:rFonts w:ascii="Aptos" w:eastAsia="Aptos" w:hAnsi="Aptos" w:cs="Aptos"/>
@@ -2044,7 +2264,7 @@
           </w:tcPr>
           <w:p>
             <w:pPr>
-              <w:spacing w:before="120" w:after="120"/>
+              <w:spacing w:before="120" w:after="120" w:line="278" w:lineRule="auto"/>
               <w:jc w:val="center"/>
               <w:rPr>
                 <w:rFonts w:ascii="Aptos" w:eastAsia="Aptos" w:hAnsi="Aptos" w:cs="Aptos"/>
@@ -2060,12 +2280,23 @@
                 <w:sz w:val="22"/>
                 <w:szCs w:val="22"/>
               </w:rPr>
-              <w:t xml:space="preserve">This is a provision that would trigger individual NDAs under its original wording. As a compromise we could agree to have our personnel sign acknowledgements to Accenture.  </w:t>
+              <w:lastRenderedPageBreak/>
+              <w:t xml:space="preserve">This is a provision that would trigger individual NDAs under its original wording. As a compromise we could agree </w:t>
+            </w:r>
+            <w:r>
+              <w:rPr>
+                <w:rFonts w:ascii="Aptos" w:eastAsia="Aptos" w:hAnsi="Aptos" w:cs="Aptos"/>
+                <w:color w:val="000000" w:themeColor="text1"/>
+                <w:sz w:val="22"/>
+                <w:szCs w:val="22"/>
+              </w:rPr>
+              <w:lastRenderedPageBreak/>
+              <w:t xml:space="preserve">to have our personnel sign acknowledgements to Accenture.  </w:t>
             </w:r>
           </w:p>
           <w:p>
             <w:pPr>
-              <w:spacing w:before="120" w:after="120"/>
+              <w:spacing w:before="120" w:after="120" w:line="278" w:lineRule="auto"/>
               <w:jc w:val="center"/>
               <w:rPr>
                 <w:rFonts w:ascii="Aptos" w:eastAsia="Aptos" w:hAnsi="Aptos" w:cs="Aptos"/>
@@ -2086,6 +2317,7 @@
           </w:p>
           <w:p>
             <w:pPr>
+              <w:spacing w:after="160" w:line="278" w:lineRule="auto"/>
               <w:jc w:val="center"/>
               <w:rPr>
                 <w:rFonts w:ascii="Aptos" w:eastAsia="Aptos" w:hAnsi="Aptos" w:cs="Aptos"/>
@@ -2111,7 +2343,7 @@
           </w:tcPr>
           <w:p>
             <w:pPr>
-              <w:spacing w:before="120" w:after="120"/>
+              <w:spacing w:before="120" w:after="120" w:line="278" w:lineRule="auto"/>
               <w:jc w:val="both"/>
               <w:rPr>
                 <w:sz w:val="22"/>
@@ -2125,6 +2357,7 @@
                 <w:sz w:val="22"/>
                 <w:szCs w:val="22"/>
               </w:rPr>
+              <w:lastRenderedPageBreak/>
               <w:t>“</w:t>
             </w:r>
             <w:r>
@@ -2150,8 +2383,7 @@
           </w:p>
           <w:p>
             <w:pPr>
-              <w:pStyle w:val="NormalWeb"/>
-              <w:spacing w:line="338" w:lineRule="atLeast"/>
+              <w:spacing w:after="160" w:line="338" w:lineRule="atLeast"/>
               <w:jc w:val="both"/>
               <w:rPr>
                 <w:rFonts w:ascii="Aptos" w:eastAsia="Aptos" w:hAnsi="Aptos" w:cs="Aptos"/>
@@ -2173,7 +2405,7 @@
           </w:tcPr>
           <w:p>
             <w:pPr>
-              <w:spacing w:before="120" w:after="120"/>
+              <w:spacing w:before="120" w:after="120" w:line="278" w:lineRule="auto"/>
               <w:jc w:val="center"/>
               <w:rPr>
                 <w:sz w:val="22"/>
@@ -2262,143 +2494,143 @@
           <w:szCs w:val="20"/>
         </w:rPr>
       </w:pPr>
+      <w:proofErr w:type="spellStart"/>
       <w:r>
         <w:rPr>
           <w:rFonts w:ascii="Consolas" w:eastAsia="Consolas" w:hAnsi="Consolas" w:cs="Consolas"/>
           <w:sz w:val="20"/>
           <w:szCs w:val="20"/>
         </w:rPr>
-        <w:t>risk_triggered: [true/false]</w:t>
-      </w:r>
-    </w:p>
-    <w:p>
-      <w:pPr>
-        <w:ind w:left="720"/>
+        <w:t>risk_triggered</w:t>
+      </w:r>
+      <w:proofErr w:type="spellEnd"/>
+      <w:r>
         <w:rPr>
           <w:rFonts w:ascii="Consolas" w:eastAsia="Consolas" w:hAnsi="Consolas" w:cs="Consolas"/>
           <w:sz w:val="20"/>
           <w:szCs w:val="20"/>
         </w:rPr>
-      </w:pPr>
-      <w:r>
+        <w:t>: [true/false]</w:t>
+      </w:r>
+    </w:p>
+    <w:p>
+      <w:pPr>
+        <w:ind w:left="720"/>
         <w:rPr>
           <w:rFonts w:ascii="Consolas" w:eastAsia="Consolas" w:hAnsi="Consolas" w:cs="Consolas"/>
           <w:sz w:val="20"/>
           <w:szCs w:val="20"/>
         </w:rPr>
-        <w:t>escalation_only: [true/null]</w:t>
-      </w:r>
-    </w:p>
-    <w:p>
-      <w:pPr>
-        <w:ind w:left="720"/>
-      </w:pPr>
+      </w:pPr>
+      <w:proofErr w:type="spellStart"/>
       <w:r>
         <w:rPr>
           <w:rFonts w:ascii="Consolas" w:eastAsia="Consolas" w:hAnsi="Consolas" w:cs="Consolas"/>
           <w:sz w:val="20"/>
           <w:szCs w:val="20"/>
         </w:rPr>
-        <w:t>risk_name: [Individual NDA or null]</w:t>
-      </w:r>
-    </w:p>
-    <w:p>
-      <w:pPr>
-        <w:ind w:firstLine="720"/>
-      </w:pPr>
+        <w:t>escalation_only</w:t>
+      </w:r>
+      <w:proofErr w:type="spellEnd"/>
       <w:r>
         <w:rPr>
           <w:rFonts w:ascii="Consolas" w:eastAsia="Consolas" w:hAnsi="Consolas" w:cs="Consolas"/>
           <w:sz w:val="20"/>
           <w:szCs w:val="20"/>
         </w:rPr>
-        <w:t>risk_description:</w:t>
+        <w:t>: [true/null]</w:t>
       </w:r>
     </w:p>
     <w:p>
       <w:pPr>
         <w:ind w:left="720"/>
       </w:pPr>
+      <w:proofErr w:type="spellStart"/>
       <w:r>
         <w:rPr>
           <w:rFonts w:ascii="Consolas" w:eastAsia="Consolas" w:hAnsi="Consolas" w:cs="Consolas"/>
           <w:sz w:val="20"/>
           <w:szCs w:val="20"/>
         </w:rPr>
-        <w:t>[Individual NDA Risk Description from the Knowledge Base, or null]</w:t>
-      </w:r>
-    </w:p>
-    <w:p>
-      <w:pPr>
-        <w:ind w:left="720"/>
+        <w:t>risk_name</w:t>
+      </w:r>
+      <w:proofErr w:type="spellEnd"/>
+      <w:r>
         <w:rPr>
           <w:rFonts w:ascii="Consolas" w:eastAsia="Consolas" w:hAnsi="Consolas" w:cs="Consolas"/>
           <w:sz w:val="20"/>
           <w:szCs w:val="20"/>
         </w:rPr>
-      </w:pPr>
+        <w:t>: [Individual NDA or null]</w:t>
+      </w:r>
+    </w:p>
+    <w:p>
+      <w:pPr>
+        <w:ind w:firstLine="720"/>
+      </w:pPr>
+      <w:proofErr w:type="spellStart"/>
       <w:r>
         <w:rPr>
           <w:rFonts w:ascii="Consolas" w:eastAsia="Consolas" w:hAnsi="Consolas" w:cs="Consolas"/>
           <w:sz w:val="20"/>
           <w:szCs w:val="20"/>
         </w:rPr>
-        <w:lastRenderedPageBreak/>
-        <w:t>original_language:</w:t>
-      </w:r>
-    </w:p>
-    <w:p>
-      <w:pPr>
-        <w:ind w:left="720"/>
+        <w:t>risk_description</w:t>
+      </w:r>
+      <w:proofErr w:type="spellEnd"/>
+      <w:r>
         <w:rPr>
           <w:rFonts w:ascii="Consolas" w:eastAsia="Consolas" w:hAnsi="Consolas" w:cs="Consolas"/>
           <w:sz w:val="20"/>
           <w:szCs w:val="20"/>
         </w:rPr>
-      </w:pPr>
-      <w:r>
+        <w:t>:</w:t>
+      </w:r>
+    </w:p>
+    <w:p>
+      <w:pPr>
+        <w:ind w:left="720"/>
         <w:rPr>
           <w:rFonts w:ascii="Consolas" w:eastAsia="Consolas" w:hAnsi="Consolas" w:cs="Consolas"/>
           <w:sz w:val="20"/>
           <w:szCs w:val="20"/>
         </w:rPr>
-        <w:t>[Exact original NDA clause text indicating direct contractual confidentiality obligations between personnel and the counterparty, individual NDAs, separate confidentiality agreements, written undertakings, or similar Individual NDA risk, or null if not triggered.</w:t>
-      </w:r>
-    </w:p>
-    <w:p>
-      <w:pPr>
-        <w:ind w:left="720"/>
+      </w:pPr>
+      <w:r>
         <w:rPr>
           <w:rFonts w:ascii="Consolas" w:eastAsia="Consolas" w:hAnsi="Consolas" w:cs="Consolas"/>
           <w:sz w:val="20"/>
           <w:szCs w:val="20"/>
         </w:rPr>
-      </w:pPr>
-      <w:r>
+        <w:t>[Exact Individual NDA Risk Description from the Knowledge Base, preserving the approved wording exactly, or null.]</w:t>
+      </w:r>
+    </w:p>
+    <w:p>
+      <w:pPr>
+        <w:ind w:left="720"/>
         <w:rPr>
           <w:rFonts w:ascii="Consolas" w:eastAsia="Consolas" w:hAnsi="Consolas" w:cs="Consolas"/>
           <w:sz w:val="20"/>
           <w:szCs w:val="20"/>
         </w:rPr>
-        <w:t>If multiple clauses are relevant, list each clause on a separate line preceded by a dash (-).</w:t>
-      </w:r>
-    </w:p>
-    <w:p>
-      <w:pPr>
-        <w:ind w:left="720"/>
+      </w:pPr>
+      <w:proofErr w:type="spellStart"/>
+      <w:r>
         <w:rPr>
           <w:rFonts w:ascii="Consolas" w:eastAsia="Consolas" w:hAnsi="Consolas" w:cs="Consolas"/>
           <w:sz w:val="20"/>
           <w:szCs w:val="20"/>
         </w:rPr>
-      </w:pPr>
+        <w:t>original_language</w:t>
+      </w:r>
+      <w:proofErr w:type="spellEnd"/>
       <w:r>
         <w:rPr>
           <w:rFonts w:ascii="Consolas" w:eastAsia="Consolas" w:hAnsi="Consolas" w:cs="Consolas"/>
           <w:sz w:val="20"/>
           <w:szCs w:val="20"/>
         </w:rPr>
-        <w:t>Preserve exact NDA text.]</w:t>
+        <w:t>:</w:t>
       </w:r>
     </w:p>
     <w:p>
@@ -2416,43 +2648,35 @@
           <w:sz w:val="20"/>
           <w:szCs w:val="20"/>
         </w:rPr>
-        <w:t>reason_for_deletion:</w:t>
+        <w:t>[Exact original NDA clause text indicating direct contractual confidentiality obligations between personnel and the counterparty, individual NDAs, separate confidentiality agreements, written undertakings, or similar Individual NDA risk, or null if not triggered.</w:t>
       </w:r>
     </w:p>
     <w:p>
       <w:pPr>
         <w:ind w:left="720"/>
-      </w:pPr>
-      <w:r>
         <w:rPr>
           <w:rFonts w:ascii="Consolas" w:eastAsia="Consolas" w:hAnsi="Consolas" w:cs="Consolas"/>
           <w:sz w:val="20"/>
           <w:szCs w:val="20"/>
         </w:rPr>
-        <w:t>[Factual explanation of why the clause presents Individual NDA Risk, including direct confidentiality obligations, separate NDAs, written undertakings, or individual acknowledgements with the counterparty, or null.]</w:t>
-      </w:r>
-    </w:p>
-    <w:p>
-      <w:pPr>
-        <w:ind w:left="720"/>
+      </w:pPr>
+      <w:r>
         <w:rPr>
           <w:rFonts w:ascii="Consolas" w:eastAsia="Consolas" w:hAnsi="Consolas" w:cs="Consolas"/>
           <w:sz w:val="20"/>
           <w:szCs w:val="20"/>
         </w:rPr>
-      </w:pPr>
-      <w:r>
+        <w:t>If multiple clauses are relevant, list each clause on a separate line preceded by a dash (-).</w:t>
+      </w:r>
+    </w:p>
+    <w:p>
+      <w:pPr>
+        <w:ind w:left="720"/>
         <w:rPr>
           <w:rFonts w:ascii="Consolas" w:eastAsia="Consolas" w:hAnsi="Consolas" w:cs="Consolas"/>
           <w:sz w:val="20"/>
           <w:szCs w:val="20"/>
         </w:rPr>
-        <w:t>mitigating_language:</w:t>
-      </w:r>
-    </w:p>
-    <w:p>
-      <w:pPr>
-        <w:ind w:left="720"/>
       </w:pPr>
       <w:r>
         <w:rPr>
@@ -2460,7 +2684,8 @@
           <w:sz w:val="20"/>
           <w:szCs w:val="20"/>
         </w:rPr>
-        <w:t>[Individual NDA Mitigation Language from the Knowledge Base, or null.]</w:t>
+        <w:lastRenderedPageBreak/>
+        <w:t>Preserve exact NDA text.]</w:t>
       </w:r>
     </w:p>
     <w:p>
@@ -2472,23 +2697,28 @@
           <w:szCs w:val="20"/>
         </w:rPr>
       </w:pPr>
+      <w:proofErr w:type="spellStart"/>
       <w:r>
         <w:rPr>
           <w:rFonts w:ascii="Consolas" w:eastAsia="Consolas" w:hAnsi="Consolas" w:cs="Consolas"/>
           <w:sz w:val="20"/>
           <w:szCs w:val="20"/>
         </w:rPr>
-        <w:t>clean_nda_fragment:</w:t>
-      </w:r>
-    </w:p>
-    <w:p>
-      <w:pPr>
-        <w:ind w:left="720"/>
+        <w:t>reason_for_deletion</w:t>
+      </w:r>
+      <w:proofErr w:type="spellEnd"/>
+      <w:r>
         <w:rPr>
           <w:rFonts w:ascii="Consolas" w:eastAsia="Consolas" w:hAnsi="Consolas" w:cs="Consolas"/>
           <w:sz w:val="20"/>
           <w:szCs w:val="20"/>
         </w:rPr>
+        <w:t>:</w:t>
+      </w:r>
+    </w:p>
+    <w:p>
+      <w:pPr>
+        <w:ind w:left="720"/>
       </w:pPr>
       <w:r>
         <w:rPr>
@@ -2496,7 +2726,7 @@
           <w:sz w:val="20"/>
           <w:szCs w:val="20"/>
         </w:rPr>
-        <w:t>[null]</w:t>
+        <w:t>[Factual explanation of why the clause presents Individual NDA Risk, including direct confidentiality obligations, separate NDAs, written undertakings, or individual acknowledgements with the counterparty, or null.]</w:t>
       </w:r>
     </w:p>
     <w:p>
@@ -2508,23 +2738,28 @@
           <w:szCs w:val="20"/>
         </w:rPr>
       </w:pPr>
+      <w:proofErr w:type="spellStart"/>
       <w:r>
         <w:rPr>
           <w:rFonts w:ascii="Consolas" w:eastAsia="Consolas" w:hAnsi="Consolas" w:cs="Consolas"/>
           <w:sz w:val="20"/>
           <w:szCs w:val="20"/>
         </w:rPr>
-        <w:t>error:</w:t>
-      </w:r>
-    </w:p>
-    <w:p>
-      <w:pPr>
-        <w:ind w:left="720"/>
+        <w:t>mitigating_language</w:t>
+      </w:r>
+      <w:proofErr w:type="spellEnd"/>
+      <w:r>
         <w:rPr>
           <w:rFonts w:ascii="Consolas" w:eastAsia="Consolas" w:hAnsi="Consolas" w:cs="Consolas"/>
           <w:sz w:val="20"/>
           <w:szCs w:val="20"/>
         </w:rPr>
+        <w:t>:</w:t>
+      </w:r>
+    </w:p>
+    <w:p>
+      <w:pPr>
+        <w:ind w:left="720"/>
       </w:pPr>
       <w:r>
         <w:rPr>
@@ -2532,7 +2767,7 @@
           <w:sz w:val="20"/>
           <w:szCs w:val="20"/>
         </w:rPr>
-        <w:t>[Processing error message or null]</w:t>
+        <w:t>[Individual NDA Mitigation Language from the Knowledge Base, or null.]</w:t>
       </w:r>
     </w:p>
     <w:p>
@@ -2544,23 +2779,106 @@
           <w:szCs w:val="20"/>
         </w:rPr>
       </w:pPr>
+      <w:proofErr w:type="spellStart"/>
       <w:r>
         <w:rPr>
           <w:rFonts w:ascii="Consolas" w:eastAsia="Consolas" w:hAnsi="Consolas" w:cs="Consolas"/>
           <w:sz w:val="20"/>
           <w:szCs w:val="20"/>
         </w:rPr>
+        <w:t>clean_nda_fragment</w:t>
+      </w:r>
+      <w:proofErr w:type="spellEnd"/>
+      <w:r>
+        <w:rPr>
+          <w:rFonts w:ascii="Consolas" w:eastAsia="Consolas" w:hAnsi="Consolas" w:cs="Consolas"/>
+          <w:sz w:val="20"/>
+          <w:szCs w:val="20"/>
+        </w:rPr>
+        <w:t>:</w:t>
+      </w:r>
+    </w:p>
+    <w:p>
+      <w:pPr>
+        <w:ind w:left="720"/>
+        <w:rPr>
+          <w:rFonts w:ascii="Consolas" w:eastAsia="Consolas" w:hAnsi="Consolas" w:cs="Consolas"/>
+          <w:sz w:val="20"/>
+          <w:szCs w:val="20"/>
+        </w:rPr>
+      </w:pPr>
+      <w:r>
+        <w:rPr>
+          <w:rFonts w:ascii="Consolas" w:eastAsia="Consolas" w:hAnsi="Consolas" w:cs="Consolas"/>
+          <w:sz w:val="20"/>
+          <w:szCs w:val="20"/>
+        </w:rPr>
+        <w:t>[null]</w:t>
+      </w:r>
+    </w:p>
+    <w:p>
+      <w:pPr>
+        <w:ind w:left="720"/>
+        <w:rPr>
+          <w:rFonts w:ascii="Consolas" w:eastAsia="Consolas" w:hAnsi="Consolas" w:cs="Consolas"/>
+          <w:sz w:val="20"/>
+          <w:szCs w:val="20"/>
+        </w:rPr>
+      </w:pPr>
+      <w:r>
+        <w:rPr>
+          <w:rFonts w:ascii="Consolas" w:eastAsia="Consolas" w:hAnsi="Consolas" w:cs="Consolas"/>
+          <w:sz w:val="20"/>
+          <w:szCs w:val="20"/>
+        </w:rPr>
+        <w:t>error:</w:t>
+      </w:r>
+    </w:p>
+    <w:p>
+      <w:pPr>
+        <w:ind w:left="720"/>
+        <w:rPr>
+          <w:rFonts w:ascii="Consolas" w:eastAsia="Consolas" w:hAnsi="Consolas" w:cs="Consolas"/>
+          <w:sz w:val="20"/>
+          <w:szCs w:val="20"/>
+        </w:rPr>
+      </w:pPr>
+      <w:r>
+        <w:rPr>
+          <w:rFonts w:ascii="Consolas" w:eastAsia="Consolas" w:hAnsi="Consolas" w:cs="Consolas"/>
+          <w:sz w:val="20"/>
+          <w:szCs w:val="20"/>
+        </w:rPr>
+        <w:t>[Processing error message or null]</w:t>
+      </w:r>
+    </w:p>
+    <w:p>
+      <w:pPr>
+        <w:ind w:left="720"/>
+        <w:rPr>
+          <w:rFonts w:ascii="Consolas" w:eastAsia="Consolas" w:hAnsi="Consolas" w:cs="Consolas"/>
+          <w:sz w:val="20"/>
+          <w:szCs w:val="20"/>
+        </w:rPr>
+      </w:pPr>
+      <w:r>
+        <w:rPr>
+          <w:rFonts w:ascii="Consolas" w:eastAsia="Consolas" w:hAnsi="Consolas" w:cs="Consolas"/>
+          <w:sz w:val="20"/>
+          <w:szCs w:val="20"/>
+        </w:rPr>
         <w:t>RESPONSE_END</w:t>
       </w:r>
     </w:p>
     <w:p>
       <w:pPr>
-        <w:pStyle w:val="Heading2"/>
-        <w:spacing w:line="279" w:lineRule="auto"/>
-        <w:rPr>
-          <w:rFonts w:ascii="Aptos" w:eastAsia="Aptos" w:hAnsi="Aptos" w:cs="Aptos"/>
-          <w:sz w:val="24"/>
-          <w:szCs w:val="24"/>
+        <w:keepNext/>
+        <w:keepLines/>
+        <w:spacing w:before="160" w:after="80" w:line="279" w:lineRule="auto"/>
+        <w:outlineLvl w:val="1"/>
+        <w:rPr>
+          <w:rFonts w:ascii="Aptos" w:eastAsia="Aptos" w:hAnsi="Aptos" w:cs="Aptos"/>
+          <w:color w:val="0F4761" w:themeColor="accent1" w:themeShade="BF"/>
         </w:rPr>
       </w:pPr>
       <w:r>
@@ -2568,6 +2886,7 @@
           <w:rFonts w:ascii="Aptos" w:eastAsia="Aptos" w:hAnsi="Aptos" w:cs="Aptos"/>
           <w:b/>
           <w:bCs/>
+          <w:color w:val="0F4761" w:themeColor="accent1" w:themeShade="BF"/>
           <w:sz w:val="26"/>
           <w:szCs w:val="26"/>
         </w:rPr>
@@ -2579,272 +2898,420 @@
         <w:rPr>
           <w:rFonts w:ascii="Aptos" w:eastAsia="Aptos" w:hAnsi="Aptos" w:cs="Aptos"/>
         </w:rPr>
-        <w:t>ALWAYS return ALL fields.</w:t>
-      </w:r>
-    </w:p>
-    <w:p>
-      <w:r>
-        <w:rPr>
-          <w:rFonts w:ascii="Aptos" w:eastAsia="Aptos" w:hAnsi="Aptos" w:cs="Aptos"/>
-        </w:rPr>
-        <w:t>If risk_triggered = false:</w:t>
-      </w:r>
-    </w:p>
-    <w:p>
-      <w:pPr>
-        <w:pStyle w:val="ListParagraph"/>
+        <w:t xml:space="preserve">ALWAYS </w:t>
+      </w:r>
+      <w:proofErr w:type="gramStart"/>
+      <w:r>
+        <w:rPr>
+          <w:rFonts w:ascii="Aptos" w:eastAsia="Aptos" w:hAnsi="Aptos" w:cs="Aptos"/>
+        </w:rPr>
+        <w:t>return</w:t>
+      </w:r>
+      <w:proofErr w:type="gramEnd"/>
+      <w:r>
+        <w:rPr>
+          <w:rFonts w:ascii="Aptos" w:eastAsia="Aptos" w:hAnsi="Aptos" w:cs="Aptos"/>
+        </w:rPr>
+        <w:t xml:space="preserve"> ALL fields.</w:t>
+      </w:r>
+    </w:p>
+    <w:p>
+      <w:r>
+        <w:rPr>
+          <w:rFonts w:ascii="Aptos" w:eastAsia="Aptos" w:hAnsi="Aptos" w:cs="Aptos"/>
+        </w:rPr>
+        <w:t xml:space="preserve">If </w:t>
+      </w:r>
+      <w:proofErr w:type="spellStart"/>
+      <w:r>
+        <w:rPr>
+          <w:rFonts w:ascii="Aptos" w:eastAsia="Aptos" w:hAnsi="Aptos" w:cs="Aptos"/>
+        </w:rPr>
+        <w:t>risk_triggered</w:t>
+      </w:r>
+      <w:proofErr w:type="spellEnd"/>
+      <w:r>
+        <w:rPr>
+          <w:rFonts w:ascii="Aptos" w:eastAsia="Aptos" w:hAnsi="Aptos" w:cs="Aptos"/>
+        </w:rPr>
+        <w:t xml:space="preserve"> = false:</w:t>
+      </w:r>
+    </w:p>
+    <w:p>
+      <w:pPr>
         <w:numPr>
           <w:ilvl w:val="0"/>
           <w:numId w:val="4"/>
         </w:numPr>
         <w:spacing w:after="0"/>
-        <w:rPr>
-          <w:rFonts w:ascii="Aptos" w:eastAsia="Aptos" w:hAnsi="Aptos" w:cs="Aptos"/>
-        </w:rPr>
-      </w:pPr>
-      <w:r>
-        <w:rPr>
-          <w:rFonts w:ascii="Aptos" w:eastAsia="Aptos" w:hAnsi="Aptos" w:cs="Aptos"/>
-        </w:rPr>
-        <w:t>escalation_only MUST be null.</w:t>
-      </w:r>
-    </w:p>
-    <w:p>
-      <w:pPr>
-        <w:pStyle w:val="ListParagraph"/>
+        <w:contextualSpacing/>
+        <w:rPr>
+          <w:rFonts w:ascii="Aptos" w:eastAsia="Aptos" w:hAnsi="Aptos" w:cs="Aptos"/>
+        </w:rPr>
+      </w:pPr>
+      <w:proofErr w:type="spellStart"/>
+      <w:r>
+        <w:rPr>
+          <w:rFonts w:ascii="Aptos" w:eastAsia="Aptos" w:hAnsi="Aptos" w:cs="Aptos"/>
+        </w:rPr>
+        <w:t>escalation_only</w:t>
+      </w:r>
+      <w:proofErr w:type="spellEnd"/>
+      <w:r>
+        <w:rPr>
+          <w:rFonts w:ascii="Aptos" w:eastAsia="Aptos" w:hAnsi="Aptos" w:cs="Aptos"/>
+        </w:rPr>
+        <w:t xml:space="preserve"> MUST be null.</w:t>
+      </w:r>
+    </w:p>
+    <w:p>
+      <w:pPr>
         <w:numPr>
           <w:ilvl w:val="0"/>
           <w:numId w:val="4"/>
         </w:numPr>
         <w:spacing w:after="0"/>
-        <w:rPr>
-          <w:rFonts w:ascii="Aptos" w:eastAsia="Aptos" w:hAnsi="Aptos" w:cs="Aptos"/>
-        </w:rPr>
-      </w:pPr>
-      <w:r>
-        <w:rPr>
-          <w:rFonts w:ascii="Aptos" w:eastAsia="Aptos" w:hAnsi="Aptos" w:cs="Aptos"/>
-        </w:rPr>
-        <w:t>risk_name MUST be null.</w:t>
-      </w:r>
-    </w:p>
-    <w:p>
-      <w:pPr>
-        <w:pStyle w:val="ListParagraph"/>
+        <w:contextualSpacing/>
+        <w:rPr>
+          <w:rFonts w:ascii="Aptos" w:eastAsia="Aptos" w:hAnsi="Aptos" w:cs="Aptos"/>
+        </w:rPr>
+      </w:pPr>
+      <w:proofErr w:type="spellStart"/>
+      <w:r>
+        <w:rPr>
+          <w:rFonts w:ascii="Aptos" w:eastAsia="Aptos" w:hAnsi="Aptos" w:cs="Aptos"/>
+        </w:rPr>
+        <w:t>risk_name</w:t>
+      </w:r>
+      <w:proofErr w:type="spellEnd"/>
+      <w:r>
+        <w:rPr>
+          <w:rFonts w:ascii="Aptos" w:eastAsia="Aptos" w:hAnsi="Aptos" w:cs="Aptos"/>
+        </w:rPr>
+        <w:t xml:space="preserve"> MUST be null.</w:t>
+      </w:r>
+    </w:p>
+    <w:p>
+      <w:pPr>
         <w:numPr>
           <w:ilvl w:val="0"/>
           <w:numId w:val="4"/>
         </w:numPr>
         <w:spacing w:after="0"/>
-        <w:rPr>
-          <w:rFonts w:ascii="Aptos" w:eastAsia="Aptos" w:hAnsi="Aptos" w:cs="Aptos"/>
-        </w:rPr>
-      </w:pPr>
-      <w:r>
-        <w:rPr>
-          <w:rFonts w:ascii="Aptos" w:eastAsia="Aptos" w:hAnsi="Aptos" w:cs="Aptos"/>
-        </w:rPr>
-        <w:t>risk_description MUST be null</w:t>
-      </w:r>
-    </w:p>
-    <w:p>
-      <w:pPr>
-        <w:pStyle w:val="ListParagraph"/>
+        <w:contextualSpacing/>
+        <w:rPr>
+          <w:rFonts w:ascii="Aptos" w:eastAsia="Aptos" w:hAnsi="Aptos" w:cs="Aptos"/>
+        </w:rPr>
+      </w:pPr>
+      <w:proofErr w:type="spellStart"/>
+      <w:r>
+        <w:rPr>
+          <w:rFonts w:ascii="Aptos" w:eastAsia="Aptos" w:hAnsi="Aptos" w:cs="Aptos"/>
+        </w:rPr>
+        <w:t>risk_description</w:t>
+      </w:r>
+      <w:proofErr w:type="spellEnd"/>
+      <w:r>
+        <w:rPr>
+          <w:rFonts w:ascii="Aptos" w:eastAsia="Aptos" w:hAnsi="Aptos" w:cs="Aptos"/>
+        </w:rPr>
+        <w:t xml:space="preserve"> MUST be null</w:t>
+      </w:r>
+    </w:p>
+    <w:p>
+      <w:pPr>
         <w:numPr>
           <w:ilvl w:val="0"/>
           <w:numId w:val="4"/>
         </w:numPr>
         <w:spacing w:after="0"/>
-        <w:rPr>
-          <w:rFonts w:ascii="Aptos" w:eastAsia="Aptos" w:hAnsi="Aptos" w:cs="Aptos"/>
-        </w:rPr>
-      </w:pPr>
-      <w:r>
-        <w:rPr>
-          <w:rFonts w:ascii="Aptos" w:eastAsia="Aptos" w:hAnsi="Aptos" w:cs="Aptos"/>
-        </w:rPr>
-        <w:t>original_language MUST be null.</w:t>
-      </w:r>
-    </w:p>
-    <w:p>
-      <w:pPr>
-        <w:pStyle w:val="ListParagraph"/>
+        <w:contextualSpacing/>
+        <w:rPr>
+          <w:rFonts w:ascii="Aptos" w:eastAsia="Aptos" w:hAnsi="Aptos" w:cs="Aptos"/>
+        </w:rPr>
+      </w:pPr>
+      <w:proofErr w:type="spellStart"/>
+      <w:r>
+        <w:rPr>
+          <w:rFonts w:ascii="Aptos" w:eastAsia="Aptos" w:hAnsi="Aptos" w:cs="Aptos"/>
+        </w:rPr>
+        <w:t>original_language</w:t>
+      </w:r>
+      <w:proofErr w:type="spellEnd"/>
+      <w:r>
+        <w:rPr>
+          <w:rFonts w:ascii="Aptos" w:eastAsia="Aptos" w:hAnsi="Aptos" w:cs="Aptos"/>
+        </w:rPr>
+        <w:t xml:space="preserve"> MUST be null.</w:t>
+      </w:r>
+    </w:p>
+    <w:p>
+      <w:pPr>
         <w:numPr>
           <w:ilvl w:val="0"/>
           <w:numId w:val="4"/>
         </w:numPr>
         <w:spacing w:after="0"/>
-        <w:rPr>
-          <w:rFonts w:ascii="Aptos" w:eastAsia="Aptos" w:hAnsi="Aptos" w:cs="Aptos"/>
-        </w:rPr>
-      </w:pPr>
-      <w:r>
-        <w:rPr>
-          <w:rFonts w:ascii="Aptos" w:eastAsia="Aptos" w:hAnsi="Aptos" w:cs="Aptos"/>
-        </w:rPr>
-        <w:t>reason_for_deletion MUST be null.</w:t>
-      </w:r>
-    </w:p>
-    <w:p>
-      <w:pPr>
-        <w:pStyle w:val="ListParagraph"/>
+        <w:contextualSpacing/>
+        <w:rPr>
+          <w:rFonts w:ascii="Aptos" w:eastAsia="Aptos" w:hAnsi="Aptos" w:cs="Aptos"/>
+        </w:rPr>
+      </w:pPr>
+      <w:proofErr w:type="spellStart"/>
+      <w:r>
+        <w:rPr>
+          <w:rFonts w:ascii="Aptos" w:eastAsia="Aptos" w:hAnsi="Aptos" w:cs="Aptos"/>
+        </w:rPr>
+        <w:t>reason_for_deletion</w:t>
+      </w:r>
+      <w:proofErr w:type="spellEnd"/>
+      <w:r>
+        <w:rPr>
+          <w:rFonts w:ascii="Aptos" w:eastAsia="Aptos" w:hAnsi="Aptos" w:cs="Aptos"/>
+        </w:rPr>
+        <w:t xml:space="preserve"> MUST be null.</w:t>
+      </w:r>
+    </w:p>
+    <w:p>
+      <w:pPr>
         <w:numPr>
           <w:ilvl w:val="0"/>
           <w:numId w:val="4"/>
         </w:numPr>
         <w:spacing w:after="0"/>
-        <w:rPr>
-          <w:rFonts w:ascii="Aptos" w:eastAsia="Aptos" w:hAnsi="Aptos" w:cs="Aptos"/>
-        </w:rPr>
-      </w:pPr>
-      <w:r>
-        <w:rPr>
-          <w:rFonts w:ascii="Aptos" w:eastAsia="Aptos" w:hAnsi="Aptos" w:cs="Aptos"/>
-        </w:rPr>
-        <w:t>mitigating_language MUST be null.</w:t>
-      </w:r>
-    </w:p>
-    <w:p>
-      <w:pPr>
-        <w:pStyle w:val="ListParagraph"/>
+        <w:contextualSpacing/>
+        <w:rPr>
+          <w:rFonts w:ascii="Aptos" w:eastAsia="Aptos" w:hAnsi="Aptos" w:cs="Aptos"/>
+        </w:rPr>
+      </w:pPr>
+      <w:proofErr w:type="spellStart"/>
+      <w:r>
+        <w:rPr>
+          <w:rFonts w:ascii="Aptos" w:eastAsia="Aptos" w:hAnsi="Aptos" w:cs="Aptos"/>
+        </w:rPr>
+        <w:t>mitigating_language</w:t>
+      </w:r>
+      <w:proofErr w:type="spellEnd"/>
+      <w:r>
+        <w:rPr>
+          <w:rFonts w:ascii="Aptos" w:eastAsia="Aptos" w:hAnsi="Aptos" w:cs="Aptos"/>
+        </w:rPr>
+        <w:t xml:space="preserve"> MUST be null.</w:t>
+      </w:r>
+    </w:p>
+    <w:p>
+      <w:pPr>
         <w:numPr>
           <w:ilvl w:val="0"/>
           <w:numId w:val="4"/>
         </w:numPr>
         <w:spacing w:after="0"/>
-        <w:rPr>
-          <w:rFonts w:ascii="Aptos" w:eastAsia="Aptos" w:hAnsi="Aptos" w:cs="Aptos"/>
-        </w:rPr>
-      </w:pPr>
-      <w:r>
-        <w:rPr>
-          <w:rFonts w:ascii="Aptos" w:eastAsia="Aptos" w:hAnsi="Aptos" w:cs="Aptos"/>
-        </w:rPr>
-        <w:t>clean_nda_fragment MUST be null.</w:t>
-      </w:r>
-    </w:p>
-    <w:p>
-      <w:pPr>
-        <w:pStyle w:val="ListParagraph"/>
+        <w:contextualSpacing/>
+        <w:rPr>
+          <w:rFonts w:ascii="Aptos" w:eastAsia="Aptos" w:hAnsi="Aptos" w:cs="Aptos"/>
+        </w:rPr>
+      </w:pPr>
+      <w:proofErr w:type="spellStart"/>
+      <w:r>
+        <w:rPr>
+          <w:rFonts w:ascii="Aptos" w:eastAsia="Aptos" w:hAnsi="Aptos" w:cs="Aptos"/>
+        </w:rPr>
+        <w:t>clean_nda_fragment</w:t>
+      </w:r>
+      <w:proofErr w:type="spellEnd"/>
+      <w:r>
+        <w:rPr>
+          <w:rFonts w:ascii="Aptos" w:eastAsia="Aptos" w:hAnsi="Aptos" w:cs="Aptos"/>
+        </w:rPr>
+        <w:t xml:space="preserve"> MUST be null.</w:t>
+      </w:r>
+    </w:p>
+    <w:p>
+      <w:pPr>
         <w:spacing w:after="0"/>
-        <w:rPr>
-          <w:rFonts w:ascii="Aptos" w:eastAsia="Aptos" w:hAnsi="Aptos" w:cs="Aptos"/>
-        </w:rPr>
-      </w:pPr>
-    </w:p>
-    <w:p>
-      <w:r>
-        <w:rPr>
-          <w:rFonts w:ascii="Aptos" w:eastAsia="Aptos" w:hAnsi="Aptos" w:cs="Aptos"/>
-        </w:rPr>
-        <w:t>If risk_triggered = true:</w:t>
-      </w:r>
-    </w:p>
-    <w:p>
-      <w:pPr>
-        <w:pStyle w:val="ListParagraph"/>
+        <w:ind w:left="720"/>
+        <w:contextualSpacing/>
+        <w:rPr>
+          <w:rFonts w:ascii="Aptos" w:eastAsia="Aptos" w:hAnsi="Aptos" w:cs="Aptos"/>
+        </w:rPr>
+      </w:pPr>
+    </w:p>
+    <w:p>
+      <w:r>
+        <w:rPr>
+          <w:rFonts w:ascii="Aptos" w:eastAsia="Aptos" w:hAnsi="Aptos" w:cs="Aptos"/>
+        </w:rPr>
+        <w:t xml:space="preserve">If </w:t>
+      </w:r>
+      <w:proofErr w:type="spellStart"/>
+      <w:r>
+        <w:rPr>
+          <w:rFonts w:ascii="Aptos" w:eastAsia="Aptos" w:hAnsi="Aptos" w:cs="Aptos"/>
+        </w:rPr>
+        <w:t>risk_triggered</w:t>
+      </w:r>
+      <w:proofErr w:type="spellEnd"/>
+      <w:r>
+        <w:rPr>
+          <w:rFonts w:ascii="Aptos" w:eastAsia="Aptos" w:hAnsi="Aptos" w:cs="Aptos"/>
+        </w:rPr>
+        <w:t xml:space="preserve"> = true:</w:t>
+      </w:r>
+    </w:p>
+    <w:p>
+      <w:pPr>
         <w:numPr>
           <w:ilvl w:val="0"/>
           <w:numId w:val="3"/>
         </w:numPr>
         <w:spacing w:after="0"/>
-        <w:rPr>
-          <w:rFonts w:ascii="Aptos" w:eastAsia="Aptos" w:hAnsi="Aptos" w:cs="Aptos"/>
-        </w:rPr>
-      </w:pPr>
-      <w:r>
-        <w:rPr>
-          <w:rFonts w:ascii="Aptos" w:eastAsia="Aptos" w:hAnsi="Aptos" w:cs="Aptos"/>
-        </w:rPr>
-        <w:t>escalation_only MUST be true.</w:t>
-      </w:r>
-    </w:p>
-    <w:p>
-      <w:pPr>
-        <w:pStyle w:val="ListParagraph"/>
+        <w:contextualSpacing/>
+        <w:rPr>
+          <w:rFonts w:ascii="Aptos" w:eastAsia="Aptos" w:hAnsi="Aptos" w:cs="Aptos"/>
+        </w:rPr>
+      </w:pPr>
+      <w:proofErr w:type="spellStart"/>
+      <w:r>
+        <w:rPr>
+          <w:rFonts w:ascii="Aptos" w:eastAsia="Aptos" w:hAnsi="Aptos" w:cs="Aptos"/>
+        </w:rPr>
+        <w:t>escalation_only</w:t>
+      </w:r>
+      <w:proofErr w:type="spellEnd"/>
+      <w:r>
+        <w:rPr>
+          <w:rFonts w:ascii="Aptos" w:eastAsia="Aptos" w:hAnsi="Aptos" w:cs="Aptos"/>
+        </w:rPr>
+        <w:t xml:space="preserve"> MUST be true.</w:t>
+      </w:r>
+    </w:p>
+    <w:p>
+      <w:pPr>
         <w:numPr>
           <w:ilvl w:val="0"/>
           <w:numId w:val="3"/>
         </w:numPr>
         <w:spacing w:after="0"/>
-        <w:rPr>
-          <w:rFonts w:ascii="Aptos" w:eastAsia="Aptos" w:hAnsi="Aptos" w:cs="Aptos"/>
-        </w:rPr>
-      </w:pPr>
-      <w:r>
-        <w:rPr>
-          <w:rFonts w:ascii="Aptos" w:eastAsia="Aptos" w:hAnsi="Aptos" w:cs="Aptos"/>
-        </w:rPr>
-        <w:t>risk_name MUST be "Individual NDA".</w:t>
-      </w:r>
-    </w:p>
-    <w:p>
-      <w:pPr>
-        <w:pStyle w:val="ListParagraph"/>
+        <w:contextualSpacing/>
+        <w:rPr>
+          <w:rFonts w:ascii="Aptos" w:eastAsia="Aptos" w:hAnsi="Aptos" w:cs="Aptos"/>
+        </w:rPr>
+      </w:pPr>
+      <w:proofErr w:type="spellStart"/>
+      <w:r>
+        <w:rPr>
+          <w:rFonts w:ascii="Aptos" w:eastAsia="Aptos" w:hAnsi="Aptos" w:cs="Aptos"/>
+        </w:rPr>
+        <w:t>risk_name</w:t>
+      </w:r>
+      <w:proofErr w:type="spellEnd"/>
+      <w:r>
+        <w:rPr>
+          <w:rFonts w:ascii="Aptos" w:eastAsia="Aptos" w:hAnsi="Aptos" w:cs="Aptos"/>
+        </w:rPr>
+        <w:t xml:space="preserve"> MUST be "Individual NDA".</w:t>
+      </w:r>
+    </w:p>
+    <w:p>
+      <w:pPr>
         <w:numPr>
           <w:ilvl w:val="0"/>
           <w:numId w:val="3"/>
         </w:numPr>
         <w:spacing w:after="0"/>
-      </w:pPr>
-      <w:r>
-        <w:lastRenderedPageBreak/>
-        <w:t>risk_description MUST use only the Static Individual NDA Risk Description from the Knowledge Base.</w:t>
-      </w:r>
-    </w:p>
-    <w:p>
-      <w:pPr>
-        <w:pStyle w:val="ListParagraph"/>
+        <w:contextualSpacing/>
+      </w:pPr>
+      <w:proofErr w:type="spellStart"/>
+      <w:r>
+        <w:t>risk_description</w:t>
+      </w:r>
+      <w:proofErr w:type="spellEnd"/>
+      <w:r>
+        <w:t xml:space="preserve"> MUST use only the Static Individual NDA Risk Description from the Knowledge Base.</w:t>
+      </w:r>
+    </w:p>
+    <w:p>
+      <w:pPr>
         <w:numPr>
           <w:ilvl w:val="0"/>
           <w:numId w:val="3"/>
         </w:numPr>
-      </w:pPr>
-      <w:r>
-        <w:t>mitigating_language MUST use only the Individual NDA Mitigation Language from the Knowledge Base.</w:t>
-      </w:r>
-    </w:p>
-    <w:p>
-      <w:pPr>
-        <w:pStyle w:val="ListParagraph"/>
+        <w:contextualSpacing/>
+      </w:pPr>
+      <w:proofErr w:type="spellStart"/>
+      <w:r>
+        <w:t>mitigating_language</w:t>
+      </w:r>
+      <w:proofErr w:type="spellEnd"/>
+      <w:r>
+        <w:t xml:space="preserve"> MUST use only the Individual NDA Mitigation Language from the Knowledge Base.</w:t>
+      </w:r>
+    </w:p>
+    <w:p>
+      <w:pPr>
         <w:numPr>
           <w:ilvl w:val="0"/>
           <w:numId w:val="3"/>
         </w:numPr>
         <w:spacing w:after="0"/>
-        <w:rPr>
-          <w:rFonts w:ascii="Aptos" w:eastAsia="Aptos" w:hAnsi="Aptos" w:cs="Aptos"/>
-        </w:rPr>
-      </w:pPr>
-      <w:r>
-        <w:rPr>
-          <w:rFonts w:ascii="Aptos" w:eastAsia="Aptos" w:hAnsi="Aptos" w:cs="Aptos"/>
-        </w:rPr>
-        <w:t>clean_nda_fragment MUST be null.</w:t>
-      </w:r>
-    </w:p>
-    <w:p>
-      <w:pPr>
-        <w:pStyle w:val="ListParagraph"/>
+        <w:contextualSpacing/>
+        <w:rPr>
+          <w:rFonts w:ascii="Aptos" w:eastAsia="Aptos" w:hAnsi="Aptos" w:cs="Aptos"/>
+        </w:rPr>
+      </w:pPr>
+      <w:proofErr w:type="spellStart"/>
+      <w:r>
+        <w:rPr>
+          <w:rFonts w:ascii="Aptos" w:eastAsia="Aptos" w:hAnsi="Aptos" w:cs="Aptos"/>
+        </w:rPr>
+        <w:t>clean_nda_fragment</w:t>
+      </w:r>
+      <w:proofErr w:type="spellEnd"/>
+      <w:r>
+        <w:rPr>
+          <w:rFonts w:ascii="Aptos" w:eastAsia="Aptos" w:hAnsi="Aptos" w:cs="Aptos"/>
+        </w:rPr>
+        <w:t xml:space="preserve"> MUST be null.</w:t>
+      </w:r>
+    </w:p>
+    <w:p>
+      <w:pPr>
         <w:spacing w:after="0"/>
-        <w:rPr>
-          <w:rFonts w:ascii="Aptos" w:eastAsia="Aptos" w:hAnsi="Aptos" w:cs="Aptos"/>
-        </w:rPr>
-      </w:pPr>
-    </w:p>
-    <w:p>
-      <w:r>
-        <w:rPr>
-          <w:rFonts w:ascii="Aptos" w:eastAsia="Aptos" w:hAnsi="Aptos" w:cs="Aptos"/>
-        </w:rPr>
-        <w:t>Extract ONLY exact NDA clause text for original_language.</w:t>
-      </w:r>
-    </w:p>
-    <w:p>
-      <w:r>
-        <w:rPr>
-          <w:rFonts w:ascii="Aptos" w:eastAsia="Aptos" w:hAnsi="Aptos" w:cs="Aptos"/>
-        </w:rPr>
+        <w:ind w:left="720"/>
+        <w:contextualSpacing/>
+        <w:rPr>
+          <w:rFonts w:ascii="Aptos" w:eastAsia="Aptos" w:hAnsi="Aptos" w:cs="Aptos"/>
+        </w:rPr>
+      </w:pPr>
+    </w:p>
+    <w:p>
+      <w:r>
+        <w:rPr>
+          <w:rFonts w:ascii="Aptos" w:eastAsia="Aptos" w:hAnsi="Aptos" w:cs="Aptos"/>
+        </w:rPr>
+        <w:t xml:space="preserve">Extract ONLY exact NDA clause text for </w:t>
+      </w:r>
+      <w:proofErr w:type="spellStart"/>
+      <w:r>
+        <w:rPr>
+          <w:rFonts w:ascii="Aptos" w:eastAsia="Aptos" w:hAnsi="Aptos" w:cs="Aptos"/>
+        </w:rPr>
+        <w:t>original_language</w:t>
+      </w:r>
+      <w:proofErr w:type="spellEnd"/>
+      <w:r>
+        <w:rPr>
+          <w:rFonts w:ascii="Aptos" w:eastAsia="Aptos" w:hAnsi="Aptos" w:cs="Aptos"/>
+        </w:rPr>
+        <w:t>.</w:t>
+      </w:r>
+    </w:p>
+    <w:p>
+      <w:r>
+        <w:rPr>
+          <w:rFonts w:ascii="Aptos" w:eastAsia="Aptos" w:hAnsi="Aptos" w:cs="Aptos"/>
+        </w:rPr>
+        <w:lastRenderedPageBreak/>
         <w:t>NEVER paraphrase extracted clauses.</w:t>
       </w:r>
     </w:p>
@@ -2866,12 +3333,12 @@
     </w:p>
     <w:p>
       <w:pPr>
-        <w:pStyle w:val="ListParagraph"/>
         <w:numPr>
           <w:ilvl w:val="0"/>
           <w:numId w:val="2"/>
         </w:numPr>
         <w:spacing w:after="0"/>
+        <w:contextualSpacing/>
         <w:rPr>
           <w:rFonts w:ascii="Aptos" w:eastAsia="Aptos" w:hAnsi="Aptos" w:cs="Aptos"/>
         </w:rPr>
@@ -2885,23 +3352,33 @@
     </w:p>
     <w:p>
       <w:pPr>
-        <w:pStyle w:val="ListParagraph"/>
         <w:numPr>
           <w:ilvl w:val="0"/>
           <w:numId w:val="2"/>
         </w:numPr>
         <w:spacing w:after="0"/>
-        <w:rPr>
-          <w:rFonts w:ascii="Aptos" w:eastAsia="Aptos" w:hAnsi="Aptos" w:cs="Aptos"/>
-        </w:rPr>
-      </w:pPr>
-      <w:r>
-        <w:rPr>
-          <w:rFonts w:ascii="Aptos" w:eastAsia="Aptos" w:hAnsi="Aptos" w:cs="Aptos"/>
-        </w:rPr>
-        <w:t>all other fields MUST be null.</w:t>
-      </w:r>
-    </w:p>
+        <w:contextualSpacing/>
+        <w:rPr>
+          <w:rFonts w:ascii="Aptos" w:eastAsia="Aptos" w:hAnsi="Aptos" w:cs="Aptos"/>
+        </w:rPr>
+      </w:pPr>
+      <w:proofErr w:type="gramStart"/>
+      <w:r>
+        <w:rPr>
+          <w:rFonts w:ascii="Aptos" w:eastAsia="Aptos" w:hAnsi="Aptos" w:cs="Aptos"/>
+        </w:rPr>
+        <w:t>all</w:t>
+      </w:r>
+      <w:proofErr w:type="gramEnd"/>
+      <w:r>
+        <w:rPr>
+          <w:rFonts w:ascii="Aptos" w:eastAsia="Aptos" w:hAnsi="Aptos" w:cs="Aptos"/>
+        </w:rPr>
+        <w:t xml:space="preserve"> other fields MUST be null.</w:t>
+      </w:r>
+    </w:p>
+    <w:p/>
+    <w:p/>
     <w:p/>
     <w:p/>
     <w:sectPr>
@@ -3770,6 +4247,155 @@
     </w:lvl>
   </w:abstractNum>
   <w:abstractNum w:abstractNumId="8" w15:restartNumberingAfterBreak="0">
+    <w:nsid w:val="60306820"/>
+    <w:multiLevelType w:val="multilevel"/>
+    <w:tmpl w:val="ADB8047A"/>
+    <w:lvl w:ilvl="0">
+      <w:start w:val="1"/>
+      <w:numFmt w:val="bullet"/>
+      <w:lvlText w:val=""/>
+      <w:lvlJc w:val="left"/>
+      <w:pPr>
+        <w:tabs>
+          <w:tab w:val="num" w:pos="720"/>
+        </w:tabs>
+        <w:ind w:left="720" w:hanging="360"/>
+      </w:pPr>
+      <w:rPr>
+        <w:rFonts w:ascii="Symbol" w:hAnsi="Symbol" w:hint="default"/>
+        <w:sz w:val="20"/>
+      </w:rPr>
+    </w:lvl>
+    <w:lvl w:ilvl="1" w:tentative="1">
+      <w:start w:val="1"/>
+      <w:numFmt w:val="bullet"/>
+      <w:lvlText w:val="o"/>
+      <w:lvlJc w:val="left"/>
+      <w:pPr>
+        <w:tabs>
+          <w:tab w:val="num" w:pos="1440"/>
+        </w:tabs>
+        <w:ind w:left="1440" w:hanging="360"/>
+      </w:pPr>
+      <w:rPr>
+        <w:rFonts w:ascii="Courier New" w:hAnsi="Courier New" w:hint="default"/>
+        <w:sz w:val="20"/>
+      </w:rPr>
+    </w:lvl>
+    <w:lvl w:ilvl="2" w:tentative="1">
+      <w:start w:val="1"/>
+      <w:numFmt w:val="bullet"/>
+      <w:lvlText w:val=""/>
+      <w:lvlJc w:val="left"/>
+      <w:pPr>
+        <w:tabs>
+          <w:tab w:val="num" w:pos="2160"/>
+        </w:tabs>
+        <w:ind w:left="2160" w:hanging="360"/>
+      </w:pPr>
+      <w:rPr>
+        <w:rFonts w:ascii="Wingdings" w:hAnsi="Wingdings" w:hint="default"/>
+        <w:sz w:val="20"/>
+      </w:rPr>
+    </w:lvl>
+    <w:lvl w:ilvl="3" w:tentative="1">
+      <w:start w:val="1"/>
+      <w:numFmt w:val="bullet"/>
+      <w:lvlText w:val=""/>
+      <w:lvlJc w:val="left"/>
+      <w:pPr>
+        <w:tabs>
+          <w:tab w:val="num" w:pos="2880"/>
+        </w:tabs>
+        <w:ind w:left="2880" w:hanging="360"/>
+      </w:pPr>
+      <w:rPr>
+        <w:rFonts w:ascii="Wingdings" w:hAnsi="Wingdings" w:hint="default"/>
+        <w:sz w:val="20"/>
+      </w:rPr>
+    </w:lvl>
+    <w:lvl w:ilvl="4" w:tentative="1">
+      <w:start w:val="1"/>
+      <w:numFmt w:val="bullet"/>
+      <w:lvlText w:val=""/>
+      <w:lvlJc w:val="left"/>
+      <w:pPr>
+        <w:tabs>
+          <w:tab w:val="num" w:pos="3600"/>
+        </w:tabs>
+        <w:ind w:left="3600" w:hanging="360"/>
+      </w:pPr>
+      <w:rPr>
+        <w:rFonts w:ascii="Wingdings" w:hAnsi="Wingdings" w:hint="default"/>
+        <w:sz w:val="20"/>
+      </w:rPr>
+    </w:lvl>
+    <w:lvl w:ilvl="5" w:tentative="1">
+      <w:start w:val="1"/>
+      <w:numFmt w:val="bullet"/>
+      <w:lvlText w:val=""/>
+      <w:lvlJc w:val="left"/>
+      <w:pPr>
+        <w:tabs>
+          <w:tab w:val="num" w:pos="4320"/>
+        </w:tabs>
+        <w:ind w:left="4320" w:hanging="360"/>
+      </w:pPr>
+      <w:rPr>
+        <w:rFonts w:ascii="Wingdings" w:hAnsi="Wingdings" w:hint="default"/>
+        <w:sz w:val="20"/>
+      </w:rPr>
+    </w:lvl>
+    <w:lvl w:ilvl="6" w:tentative="1">
+      <w:start w:val="1"/>
+      <w:numFmt w:val="bullet"/>
+      <w:lvlText w:val=""/>
+      <w:lvlJc w:val="left"/>
+      <w:pPr>
+        <w:tabs>
+          <w:tab w:val="num" w:pos="5040"/>
+        </w:tabs>
+        <w:ind w:left="5040" w:hanging="360"/>
+      </w:pPr>
+      <w:rPr>
+        <w:rFonts w:ascii="Wingdings" w:hAnsi="Wingdings" w:hint="default"/>
+        <w:sz w:val="20"/>
+      </w:rPr>
+    </w:lvl>
+    <w:lvl w:ilvl="7" w:tentative="1">
+      <w:start w:val="1"/>
+      <w:numFmt w:val="bullet"/>
+      <w:lvlText w:val=""/>
+      <w:lvlJc w:val="left"/>
+      <w:pPr>
+        <w:tabs>
+          <w:tab w:val="num" w:pos="5760"/>
+        </w:tabs>
+        <w:ind w:left="5760" w:hanging="360"/>
+      </w:pPr>
+      <w:rPr>
+        <w:rFonts w:ascii="Wingdings" w:hAnsi="Wingdings" w:hint="default"/>
+        <w:sz w:val="20"/>
+      </w:rPr>
+    </w:lvl>
+    <w:lvl w:ilvl="8" w:tentative="1">
+      <w:start w:val="1"/>
+      <w:numFmt w:val="bullet"/>
+      <w:lvlText w:val=""/>
+      <w:lvlJc w:val="left"/>
+      <w:pPr>
+        <w:tabs>
+          <w:tab w:val="num" w:pos="6480"/>
+        </w:tabs>
+        <w:ind w:left="6480" w:hanging="360"/>
+      </w:pPr>
+      <w:rPr>
+        <w:rFonts w:ascii="Wingdings" w:hAnsi="Wingdings" w:hint="default"/>
+        <w:sz w:val="20"/>
+      </w:rPr>
+    </w:lvl>
+  </w:abstractNum>
+  <w:abstractNum w:abstractNumId="9" w15:restartNumberingAfterBreak="0">
     <w:nsid w:val="7506142C"/>
     <w:multiLevelType w:val="hybridMultilevel"/>
     <w:tmpl w:val="284A0420"/>
@@ -3882,7 +4508,7 @@
       </w:rPr>
     </w:lvl>
   </w:abstractNum>
-  <w:abstractNum w:abstractNumId="9" w15:restartNumberingAfterBreak="0">
+  <w:abstractNum w:abstractNumId="10" w15:restartNumberingAfterBreak="0">
     <w:nsid w:val="7C523902"/>
     <w:multiLevelType w:val="hybridMultilevel"/>
     <w:tmpl w:val="D398FA68"/>
@@ -4011,19 +4637,22 @@
     <w:abstractNumId w:val="4"/>
   </w:num>
   <w:num w:numId="6" w16cid:durableId="2013757290">
-    <w:abstractNumId w:val="9"/>
+    <w:abstractNumId w:val="10"/>
   </w:num>
   <w:num w:numId="7" w16cid:durableId="1701585433">
     <w:abstractNumId w:val="0"/>
   </w:num>
   <w:num w:numId="8" w16cid:durableId="1484857469">
-    <w:abstractNumId w:val="8"/>
+    <w:abstractNumId w:val="9"/>
   </w:num>
   <w:num w:numId="9" w16cid:durableId="263079911">
     <w:abstractNumId w:val="3"/>
   </w:num>
   <w:num w:numId="10" w16cid:durableId="350451368">
     <w:abstractNumId w:val="1"/>
+  </w:num>
+  <w:num w:numId="11" w16cid:durableId="502281824">
+    <w:abstractNumId w:val="8"/>
   </w:num>
 </w:numbering>
 </file>

</xml_diff>

<commit_message>
Add mitigation: to the static mitigation for individual
</commit_message>
<xml_diff>
--- a/docs/individual_nda_kb.docx
+++ b/docs/individual_nda_kb.docx
@@ -769,7 +769,19 @@
     </w:p>
     <w:p>
       <w:r>
-        <w:t>The wording beginning with “Delete the clause or reword as needed” is mandatory and MUST NOT be omitted.</w:t>
+        <w:t>The wording beginning with “</w:t>
+      </w:r>
+      <w:r>
+        <w:t xml:space="preserve">Mitigation: </w:t>
+      </w:r>
+      <w:r>
+        <w:t>Delete the clause or reword as needed</w:t>
+      </w:r>
+      <w:r>
+        <w:t>...”</w:t>
+      </w:r>
+      <w:r>
+        <w:t xml:space="preserve"> is mandatory and MUST NOT be omitted.</w:t>
       </w:r>
     </w:p>
     <w:p>

</xml_diff>

<commit_message>
Add mitigation: to static mitigation for individual
</commit_message>
<xml_diff>
--- a/docs/individual_nda_kb.docx
+++ b/docs/individual_nda_kb.docx
@@ -57,15 +57,7 @@
     </w:p>
     <w:p>
       <w:r>
-        <w:t xml:space="preserve">Individual NDA risk exists when an NDA requires Accenture employees, contractors, consultants, representatives, subcontractors, or other personnel to </w:t>
-      </w:r>
-      <w:proofErr w:type="gramStart"/>
-      <w:r>
-        <w:t>enter into</w:t>
-      </w:r>
-      <w:proofErr w:type="gramEnd"/>
-      <w:r>
-        <w:t xml:space="preserve"> confidentiality obligations directly with the client or counterparty.</w:t>
+        <w:t>Individual NDA risk exists when an NDA requires Accenture employees, contractors, consultants, representatives, subcontractors, or other personnel to enter into confidentiality obligations directly with the client or counterparty.</w:t>
       </w:r>
     </w:p>
     <w:p>
@@ -515,48 +507,20 @@
         <w:rPr>
           <w:rFonts w:ascii="Aptos" w:eastAsia="Aptos" w:hAnsi="Aptos" w:cs="Aptos"/>
         </w:rPr>
-        <w:t xml:space="preserve">Do NOT trigger Individual NDA where the clause only states that such </w:t>
-      </w:r>
-      <w:proofErr w:type="gramStart"/>
-      <w:r>
-        <w:rPr>
-          <w:rFonts w:ascii="Aptos" w:eastAsia="Aptos" w:hAnsi="Aptos" w:cs="Aptos"/>
-        </w:rPr>
-        <w:t>persons</w:t>
-      </w:r>
-      <w:proofErr w:type="gramEnd"/>
-      <w:r>
-        <w:rPr>
-          <w:rFonts w:ascii="Aptos" w:eastAsia="Aptos" w:hAnsi="Aptos" w:cs="Aptos"/>
-        </w:rPr>
-        <w:t xml:space="preserve"> are aware of, informed of, or agree to observe the NDA terms by signing the same agreement, without requiring a separate document directly with the counterparty.</w:t>
-      </w:r>
-    </w:p>
-    <w:p>
-      <w:pPr>
-        <w:rPr>
-          <w:rFonts w:ascii="Aptos" w:eastAsia="Aptos" w:hAnsi="Aptos" w:cs="Aptos"/>
-        </w:rPr>
-      </w:pPr>
-      <w:r>
-        <w:rPr>
-          <w:rFonts w:ascii="Aptos" w:eastAsia="Aptos" w:hAnsi="Aptos" w:cs="Aptos"/>
-        </w:rPr>
-        <w:t xml:space="preserve">Do NOT trigger Individual NDA where the clause contains acknowledgement, conformity, consent, or signature language, but the same clause confirms that the Receiving Party / Recipient / Provider remains responsible for the conduct or breach of those </w:t>
-      </w:r>
-      <w:proofErr w:type="gramStart"/>
-      <w:r>
-        <w:rPr>
-          <w:rFonts w:ascii="Aptos" w:eastAsia="Aptos" w:hAnsi="Aptos" w:cs="Aptos"/>
-        </w:rPr>
-        <w:t>persons</w:t>
-      </w:r>
-      <w:proofErr w:type="gramEnd"/>
-      <w:r>
-        <w:rPr>
-          <w:rFonts w:ascii="Aptos" w:eastAsia="Aptos" w:hAnsi="Aptos" w:cs="Aptos"/>
-        </w:rPr>
-        <w:t>.</w:t>
+        <w:t>Do NOT trigger Individual NDA where the clause only states that such persons are aware of, informed of, or agree to observe the NDA terms by signing the same agreement, without requiring a separate document directly with the counterparty.</w:t>
+      </w:r>
+    </w:p>
+    <w:p>
+      <w:pPr>
+        <w:rPr>
+          <w:rFonts w:ascii="Aptos" w:eastAsia="Aptos" w:hAnsi="Aptos" w:cs="Aptos"/>
+        </w:rPr>
+      </w:pPr>
+      <w:r>
+        <w:rPr>
+          <w:rFonts w:ascii="Aptos" w:eastAsia="Aptos" w:hAnsi="Aptos" w:cs="Aptos"/>
+        </w:rPr>
+        <w:t>Do NOT trigger Individual NDA where the clause contains acknowledgement, conformity, consent, or signature language, but the same clause confirms that the Receiving Party / Recipient / Provider remains responsible for the conduct or breach of those persons.</w:t>
       </w:r>
     </w:p>
     <w:p>
@@ -639,19 +603,11 @@
           <w:rFonts w:ascii="Aptos" w:eastAsia="Aptos" w:hAnsi="Aptos" w:cs="Aptos"/>
         </w:rPr>
       </w:pPr>
-      <w:proofErr w:type="gramStart"/>
-      <w:r>
-        <w:rPr>
-          <w:rFonts w:ascii="Aptos" w:eastAsia="Aptos" w:hAnsi="Aptos" w:cs="Aptos"/>
-        </w:rPr>
-        <w:t>Individual NDA Risk</w:t>
-      </w:r>
-      <w:proofErr w:type="gramEnd"/>
-      <w:r>
-        <w:rPr>
-          <w:rFonts w:ascii="Aptos" w:eastAsia="Aptos" w:hAnsi="Aptos" w:cs="Aptos"/>
-        </w:rPr>
-        <w:t xml:space="preserve"> is present only where personnel are required to enter confidentiality obligations directly with the counterparty.</w:t>
+      <w:r>
+        <w:rPr>
+          <w:rFonts w:ascii="Aptos" w:eastAsia="Aptos" w:hAnsi="Aptos" w:cs="Aptos"/>
+        </w:rPr>
+        <w:t>Individual NDA Risk is present only where personnel are required to enter confidentiality obligations directly with the counterparty.</w:t>
       </w:r>
     </w:p>
     <w:p>
@@ -683,15 +639,7 @@
     </w:p>
     <w:p>
       <w:r>
-        <w:t xml:space="preserve">A </w:t>
-      </w:r>
-      <w:proofErr w:type="gramStart"/>
-      <w:r>
-        <w:t>same-document</w:t>
-      </w:r>
-      <w:proofErr w:type="gramEnd"/>
-      <w:r>
-        <w:t xml:space="preserve"> acknowledgement, conformity statement, or signature block by Authorized Recipients or similar persons does not by itself create Individual NDA Risk. The agent must confirm that the clause requires a separate NDA, separate undertaking, separate acknowledgement letter, separate written agreement, or direct delivery of such document to the counterparty before triggering Individual NDA.</w:t>
+        <w:t>A same-document acknowledgement, conformity statement, or signature block by Authorized Recipients or similar persons does not by itself create Individual NDA Risk. The agent must confirm that the clause requires a separate NDA, separate undertaking, separate acknowledgement letter, separate written agreement, or direct delivery of such document to the counterparty before triggering Individual NDA.</w:t>
       </w:r>
     </w:p>
     <w:p>
@@ -718,21 +666,20 @@
     </w:p>
     <w:p>
       <w:r>
-        <w:t xml:space="preserve">When Individual NDA Risk is triggered, </w:t>
-      </w:r>
-      <w:proofErr w:type="spellStart"/>
-      <w:r>
-        <w:t>mitigating_language</w:t>
-      </w:r>
-      <w:proofErr w:type="spellEnd"/>
-      <w:r>
-        <w:t xml:space="preserve"> MUST use the following approved static text exactly:</w:t>
+        <w:t>When Individual NDA Risk is triggered, mitigating_language MUST use the following approved static text exactly:</w:t>
       </w:r>
     </w:p>
     <w:p>
       <w:pPr>
         <w:ind w:left="720"/>
       </w:pPr>
+      <w:r>
+        <w:rPr>
+          <w:rFonts w:ascii="Courier New" w:hAnsi="Courier New" w:cs="Courier New"/>
+          <w:color w:val="000000" w:themeColor="text1"/>
+        </w:rPr>
+        <w:t xml:space="preserve">Mitigation: </w:t>
+      </w:r>
       <w:r>
         <w:rPr>
           <w:rFonts w:ascii="Courier New" w:hAnsi="Courier New" w:cs="Courier New"/>
@@ -902,15 +849,7 @@
     </w:p>
     <w:p>
       <w:r>
-        <w:t xml:space="preserve">Always evaluate whether personnel are required to </w:t>
-      </w:r>
-      <w:proofErr w:type="gramStart"/>
-      <w:r>
-        <w:t>enter into</w:t>
-      </w:r>
-      <w:proofErr w:type="gramEnd"/>
-      <w:r>
-        <w:t xml:space="preserve"> obligations directly with the counterparty.</w:t>
+        <w:t>Always evaluate whether personnel are required to enter into obligations directly with the counterparty.</w:t>
       </w:r>
     </w:p>
     <w:p>
@@ -1052,39 +991,7 @@
                 <w:sz w:val="22"/>
                 <w:szCs w:val="22"/>
               </w:rPr>
-              <w:t xml:space="preserve">We can procure compliance without </w:t>
-            </w:r>
-            <w:proofErr w:type="gramStart"/>
-            <w:r>
-              <w:rPr>
-                <w:sz w:val="22"/>
-                <w:szCs w:val="22"/>
-              </w:rPr>
-              <w:t>need</w:t>
-            </w:r>
-            <w:proofErr w:type="gramEnd"/>
-            <w:r>
-              <w:rPr>
-                <w:sz w:val="22"/>
-                <w:szCs w:val="22"/>
-              </w:rPr>
-              <w:t xml:space="preserve"> to have people sign individual </w:t>
-            </w:r>
-            <w:proofErr w:type="gramStart"/>
-            <w:r>
-              <w:rPr>
-                <w:sz w:val="22"/>
-                <w:szCs w:val="22"/>
-              </w:rPr>
-              <w:t>NDA’s</w:t>
-            </w:r>
-            <w:proofErr w:type="gramEnd"/>
-            <w:r>
-              <w:rPr>
-                <w:sz w:val="22"/>
-                <w:szCs w:val="22"/>
-              </w:rPr>
-              <w:t>. Acceptable provision</w:t>
+              <w:t>We can procure compliance without need to have people sign individual NDA’s. Acceptable provision</w:t>
             </w:r>
           </w:p>
         </w:tc>
@@ -1178,27 +1085,7 @@
                 <w:sz w:val="22"/>
                 <w:szCs w:val="22"/>
               </w:rPr>
-              <w:t xml:space="preserve">Recipient's Representatives acting for the sole benefit of Recipient, who have a need to know, are under a duty of non-disclosure with respect to such </w:t>
-            </w:r>
-            <w:proofErr w:type="gramStart"/>
-            <w:r>
-              <w:rPr>
-                <w:i/>
-                <w:iCs/>
-                <w:sz w:val="22"/>
-                <w:szCs w:val="22"/>
-              </w:rPr>
-              <w:t>information, and</w:t>
-            </w:r>
-            <w:proofErr w:type="gramEnd"/>
-            <w:r>
-              <w:rPr>
-                <w:i/>
-                <w:iCs/>
-                <w:sz w:val="22"/>
-                <w:szCs w:val="22"/>
-              </w:rPr>
-              <w:t xml:space="preserve"> are under a duty to implement appropriate measures to maintain the confidentiality, security and integrity of such information.</w:t>
+              <w:t>Recipient's Representatives acting for the sole benefit of Recipient, who have a need to know, are under a duty of non-disclosure with respect to such information, and are under a duty to implement appropriate measures to maintain the confidentiality, security and integrity of such information.</w:t>
             </w:r>
             <w:r>
               <w:rPr>
@@ -2506,97 +2393,93 @@
           <w:szCs w:val="20"/>
         </w:rPr>
       </w:pPr>
-      <w:proofErr w:type="spellStart"/>
       <w:r>
         <w:rPr>
           <w:rFonts w:ascii="Consolas" w:eastAsia="Consolas" w:hAnsi="Consolas" w:cs="Consolas"/>
           <w:sz w:val="20"/>
           <w:szCs w:val="20"/>
         </w:rPr>
-        <w:t>risk_triggered</w:t>
-      </w:r>
-      <w:proofErr w:type="spellEnd"/>
-      <w:r>
+        <w:t>risk_triggered: [true/false]</w:t>
+      </w:r>
+    </w:p>
+    <w:p>
+      <w:pPr>
+        <w:ind w:left="720"/>
         <w:rPr>
           <w:rFonts w:ascii="Consolas" w:eastAsia="Consolas" w:hAnsi="Consolas" w:cs="Consolas"/>
           <w:sz w:val="20"/>
           <w:szCs w:val="20"/>
         </w:rPr>
-        <w:t>: [true/false]</w:t>
-      </w:r>
-    </w:p>
-    <w:p>
-      <w:pPr>
-        <w:ind w:left="720"/>
+      </w:pPr>
+      <w:r>
         <w:rPr>
           <w:rFonts w:ascii="Consolas" w:eastAsia="Consolas" w:hAnsi="Consolas" w:cs="Consolas"/>
           <w:sz w:val="20"/>
           <w:szCs w:val="20"/>
         </w:rPr>
-      </w:pPr>
-      <w:proofErr w:type="spellStart"/>
+        <w:t>escalation_only: [true/null]</w:t>
+      </w:r>
+    </w:p>
+    <w:p>
+      <w:pPr>
+        <w:ind w:left="720"/>
+      </w:pPr>
       <w:r>
         <w:rPr>
           <w:rFonts w:ascii="Consolas" w:eastAsia="Consolas" w:hAnsi="Consolas" w:cs="Consolas"/>
           <w:sz w:val="20"/>
           <w:szCs w:val="20"/>
         </w:rPr>
-        <w:t>escalation_only</w:t>
-      </w:r>
-      <w:proofErr w:type="spellEnd"/>
+        <w:t>risk_name: [Individual NDA or null]</w:t>
+      </w:r>
+    </w:p>
+    <w:p>
+      <w:pPr>
+        <w:ind w:firstLine="720"/>
+      </w:pPr>
       <w:r>
         <w:rPr>
           <w:rFonts w:ascii="Consolas" w:eastAsia="Consolas" w:hAnsi="Consolas" w:cs="Consolas"/>
           <w:sz w:val="20"/>
           <w:szCs w:val="20"/>
         </w:rPr>
-        <w:t>: [true/null]</w:t>
+        <w:t>risk_description:</w:t>
       </w:r>
     </w:p>
     <w:p>
       <w:pPr>
         <w:ind w:left="720"/>
-      </w:pPr>
-      <w:proofErr w:type="spellStart"/>
-      <w:r>
         <w:rPr>
           <w:rFonts w:ascii="Consolas" w:eastAsia="Consolas" w:hAnsi="Consolas" w:cs="Consolas"/>
           <w:sz w:val="20"/>
           <w:szCs w:val="20"/>
         </w:rPr>
-        <w:t>risk_name</w:t>
-      </w:r>
-      <w:proofErr w:type="spellEnd"/>
+      </w:pPr>
       <w:r>
         <w:rPr>
           <w:rFonts w:ascii="Consolas" w:eastAsia="Consolas" w:hAnsi="Consolas" w:cs="Consolas"/>
           <w:sz w:val="20"/>
           <w:szCs w:val="20"/>
         </w:rPr>
-        <w:t>: [Individual NDA or null]</w:t>
-      </w:r>
-    </w:p>
-    <w:p>
-      <w:pPr>
-        <w:ind w:firstLine="720"/>
-      </w:pPr>
-      <w:proofErr w:type="spellStart"/>
-      <w:r>
+        <w:t>[Exact Individual NDA Risk Description from the Knowledge Base, preserving the approved wording exactly, or null.]</w:t>
+      </w:r>
+    </w:p>
+    <w:p>
+      <w:pPr>
+        <w:ind w:left="720"/>
         <w:rPr>
           <w:rFonts w:ascii="Consolas" w:eastAsia="Consolas" w:hAnsi="Consolas" w:cs="Consolas"/>
           <w:sz w:val="20"/>
           <w:szCs w:val="20"/>
         </w:rPr>
-        <w:t>risk_description</w:t>
-      </w:r>
-      <w:proofErr w:type="spellEnd"/>
+      </w:pPr>
       <w:r>
         <w:rPr>
           <w:rFonts w:ascii="Consolas" w:eastAsia="Consolas" w:hAnsi="Consolas" w:cs="Consolas"/>
           <w:sz w:val="20"/>
           <w:szCs w:val="20"/>
         </w:rPr>
-        <w:t>:</w:t>
+        <w:t>original_language:</w:t>
       </w:r>
     </w:p>
     <w:p>
@@ -2614,7 +2497,7 @@
           <w:sz w:val="20"/>
           <w:szCs w:val="20"/>
         </w:rPr>
-        <w:t>[Exact Individual NDA Risk Description from the Knowledge Base, preserving the approved wording exactly, or null.]</w:t>
+        <w:t>[Exact original NDA clause text indicating direct contractual confidentiality obligations between personnel and the counterparty, individual NDAs, separate confidentiality agreements, written undertakings, or similar Individual NDA risk, or null if not triggered.</w:t>
       </w:r>
     </w:p>
     <w:p>
@@ -2626,51 +2509,55 @@
           <w:szCs w:val="20"/>
         </w:rPr>
       </w:pPr>
-      <w:proofErr w:type="spellStart"/>
       <w:r>
         <w:rPr>
           <w:rFonts w:ascii="Consolas" w:eastAsia="Consolas" w:hAnsi="Consolas" w:cs="Consolas"/>
           <w:sz w:val="20"/>
           <w:szCs w:val="20"/>
         </w:rPr>
-        <w:t>original_language</w:t>
-      </w:r>
-      <w:proofErr w:type="spellEnd"/>
-      <w:r>
+        <w:t>If multiple clauses are relevant, list each clause on a separate line preceded by a dash (-).</w:t>
+      </w:r>
+    </w:p>
+    <w:p>
+      <w:pPr>
+        <w:ind w:left="720"/>
         <w:rPr>
           <w:rFonts w:ascii="Consolas" w:eastAsia="Consolas" w:hAnsi="Consolas" w:cs="Consolas"/>
           <w:sz w:val="20"/>
           <w:szCs w:val="20"/>
         </w:rPr>
-        <w:t>:</w:t>
-      </w:r>
-    </w:p>
-    <w:p>
-      <w:pPr>
-        <w:ind w:left="720"/>
+      </w:pPr>
+      <w:r>
         <w:rPr>
           <w:rFonts w:ascii="Consolas" w:eastAsia="Consolas" w:hAnsi="Consolas" w:cs="Consolas"/>
           <w:sz w:val="20"/>
           <w:szCs w:val="20"/>
         </w:rPr>
-      </w:pPr>
-      <w:r>
+        <w:lastRenderedPageBreak/>
+        <w:t>Preserve exact NDA text.]</w:t>
+      </w:r>
+    </w:p>
+    <w:p>
+      <w:pPr>
+        <w:ind w:left="720"/>
         <w:rPr>
           <w:rFonts w:ascii="Consolas" w:eastAsia="Consolas" w:hAnsi="Consolas" w:cs="Consolas"/>
           <w:sz w:val="20"/>
           <w:szCs w:val="20"/>
         </w:rPr>
-        <w:t>[Exact original NDA clause text indicating direct contractual confidentiality obligations between personnel and the counterparty, individual NDAs, separate confidentiality agreements, written undertakings, or similar Individual NDA risk, or null if not triggered.</w:t>
-      </w:r>
-    </w:p>
-    <w:p>
-      <w:pPr>
-        <w:ind w:left="720"/>
+      </w:pPr>
+      <w:r>
         <w:rPr>
           <w:rFonts w:ascii="Consolas" w:eastAsia="Consolas" w:hAnsi="Consolas" w:cs="Consolas"/>
           <w:sz w:val="20"/>
           <w:szCs w:val="20"/>
         </w:rPr>
+        <w:t>reason_for_deletion:</w:t>
+      </w:r>
+    </w:p>
+    <w:p>
+      <w:pPr>
+        <w:ind w:left="720"/>
       </w:pPr>
       <w:r>
         <w:rPr>
@@ -2678,7 +2565,7 @@
           <w:sz w:val="20"/>
           <w:szCs w:val="20"/>
         </w:rPr>
-        <w:t>If multiple clauses are relevant, list each clause on a separate line preceded by a dash (-).</w:t>
+        <w:t>[Factual explanation of why the clause presents Individual NDA Risk, including direct confidentiality obligations, separate NDAs, written undertakings, or individual acknowledgements with the counterparty, or null.]</w:t>
       </w:r>
     </w:p>
     <w:p>
@@ -2696,118 +2583,38 @@
           <w:sz w:val="20"/>
           <w:szCs w:val="20"/>
         </w:rPr>
-        <w:lastRenderedPageBreak/>
-        <w:t>Preserve exact NDA text.]</w:t>
+        <w:t>mitigating_language:</w:t>
       </w:r>
     </w:p>
     <w:p>
       <w:pPr>
         <w:ind w:left="720"/>
+      </w:pPr>
+      <w:r>
         <w:rPr>
           <w:rFonts w:ascii="Consolas" w:eastAsia="Consolas" w:hAnsi="Consolas" w:cs="Consolas"/>
           <w:sz w:val="20"/>
           <w:szCs w:val="20"/>
         </w:rPr>
-      </w:pPr>
-      <w:proofErr w:type="spellStart"/>
-      <w:r>
+        <w:t>[Individual NDA Mitigation Language from the Knowledge Base, or null.]</w:t>
+      </w:r>
+    </w:p>
+    <w:p>
+      <w:pPr>
+        <w:ind w:left="720"/>
         <w:rPr>
           <w:rFonts w:ascii="Consolas" w:eastAsia="Consolas" w:hAnsi="Consolas" w:cs="Consolas"/>
           <w:sz w:val="20"/>
           <w:szCs w:val="20"/>
         </w:rPr>
-        <w:t>reason_for_deletion</w:t>
-      </w:r>
-      <w:proofErr w:type="spellEnd"/>
+      </w:pPr>
       <w:r>
         <w:rPr>
           <w:rFonts w:ascii="Consolas" w:eastAsia="Consolas" w:hAnsi="Consolas" w:cs="Consolas"/>
           <w:sz w:val="20"/>
           <w:szCs w:val="20"/>
         </w:rPr>
-        <w:t>:</w:t>
-      </w:r>
-    </w:p>
-    <w:p>
-      <w:pPr>
-        <w:ind w:left="720"/>
-      </w:pPr>
-      <w:r>
-        <w:rPr>
-          <w:rFonts w:ascii="Consolas" w:eastAsia="Consolas" w:hAnsi="Consolas" w:cs="Consolas"/>
-          <w:sz w:val="20"/>
-          <w:szCs w:val="20"/>
-        </w:rPr>
-        <w:t>[Factual explanation of why the clause presents Individual NDA Risk, including direct confidentiality obligations, separate NDAs, written undertakings, or individual acknowledgements with the counterparty, or null.]</w:t>
-      </w:r>
-    </w:p>
-    <w:p>
-      <w:pPr>
-        <w:ind w:left="720"/>
-        <w:rPr>
-          <w:rFonts w:ascii="Consolas" w:eastAsia="Consolas" w:hAnsi="Consolas" w:cs="Consolas"/>
-          <w:sz w:val="20"/>
-          <w:szCs w:val="20"/>
-        </w:rPr>
-      </w:pPr>
-      <w:proofErr w:type="spellStart"/>
-      <w:r>
-        <w:rPr>
-          <w:rFonts w:ascii="Consolas" w:eastAsia="Consolas" w:hAnsi="Consolas" w:cs="Consolas"/>
-          <w:sz w:val="20"/>
-          <w:szCs w:val="20"/>
-        </w:rPr>
-        <w:t>mitigating_language</w:t>
-      </w:r>
-      <w:proofErr w:type="spellEnd"/>
-      <w:r>
-        <w:rPr>
-          <w:rFonts w:ascii="Consolas" w:eastAsia="Consolas" w:hAnsi="Consolas" w:cs="Consolas"/>
-          <w:sz w:val="20"/>
-          <w:szCs w:val="20"/>
-        </w:rPr>
-        <w:t>:</w:t>
-      </w:r>
-    </w:p>
-    <w:p>
-      <w:pPr>
-        <w:ind w:left="720"/>
-      </w:pPr>
-      <w:r>
-        <w:rPr>
-          <w:rFonts w:ascii="Consolas" w:eastAsia="Consolas" w:hAnsi="Consolas" w:cs="Consolas"/>
-          <w:sz w:val="20"/>
-          <w:szCs w:val="20"/>
-        </w:rPr>
-        <w:t>[Individual NDA Mitigation Language from the Knowledge Base, or null.]</w:t>
-      </w:r>
-    </w:p>
-    <w:p>
-      <w:pPr>
-        <w:ind w:left="720"/>
-        <w:rPr>
-          <w:rFonts w:ascii="Consolas" w:eastAsia="Consolas" w:hAnsi="Consolas" w:cs="Consolas"/>
-          <w:sz w:val="20"/>
-          <w:szCs w:val="20"/>
-        </w:rPr>
-      </w:pPr>
-      <w:proofErr w:type="spellStart"/>
-      <w:r>
-        <w:rPr>
-          <w:rFonts w:ascii="Consolas" w:eastAsia="Consolas" w:hAnsi="Consolas" w:cs="Consolas"/>
-          <w:sz w:val="20"/>
-          <w:szCs w:val="20"/>
-        </w:rPr>
-        <w:t>clean_nda_fragment</w:t>
-      </w:r>
-      <w:proofErr w:type="spellEnd"/>
-      <w:r>
-        <w:rPr>
-          <w:rFonts w:ascii="Consolas" w:eastAsia="Consolas" w:hAnsi="Consolas" w:cs="Consolas"/>
-          <w:sz w:val="20"/>
-          <w:szCs w:val="20"/>
-        </w:rPr>
-        <w:t>:</w:t>
+        <w:t>clean_nda_fragment:</w:t>
       </w:r>
     </w:p>
     <w:p>
@@ -2910,43 +2717,15 @@
         <w:rPr>
           <w:rFonts w:ascii="Aptos" w:eastAsia="Aptos" w:hAnsi="Aptos" w:cs="Aptos"/>
         </w:rPr>
-        <w:t xml:space="preserve">ALWAYS </w:t>
-      </w:r>
-      <w:proofErr w:type="gramStart"/>
-      <w:r>
-        <w:rPr>
-          <w:rFonts w:ascii="Aptos" w:eastAsia="Aptos" w:hAnsi="Aptos" w:cs="Aptos"/>
-        </w:rPr>
-        <w:t>return</w:t>
-      </w:r>
-      <w:proofErr w:type="gramEnd"/>
-      <w:r>
-        <w:rPr>
-          <w:rFonts w:ascii="Aptos" w:eastAsia="Aptos" w:hAnsi="Aptos" w:cs="Aptos"/>
-        </w:rPr>
-        <w:t xml:space="preserve"> ALL fields.</w:t>
-      </w:r>
-    </w:p>
-    <w:p>
-      <w:r>
-        <w:rPr>
-          <w:rFonts w:ascii="Aptos" w:eastAsia="Aptos" w:hAnsi="Aptos" w:cs="Aptos"/>
-        </w:rPr>
-        <w:t xml:space="preserve">If </w:t>
-      </w:r>
-      <w:proofErr w:type="spellStart"/>
-      <w:r>
-        <w:rPr>
-          <w:rFonts w:ascii="Aptos" w:eastAsia="Aptos" w:hAnsi="Aptos" w:cs="Aptos"/>
-        </w:rPr>
-        <w:t>risk_triggered</w:t>
-      </w:r>
-      <w:proofErr w:type="spellEnd"/>
-      <w:r>
-        <w:rPr>
-          <w:rFonts w:ascii="Aptos" w:eastAsia="Aptos" w:hAnsi="Aptos" w:cs="Aptos"/>
-        </w:rPr>
-        <w:t xml:space="preserve"> = false:</w:t>
+        <w:t>ALWAYS return ALL fields.</w:t>
+      </w:r>
+    </w:p>
+    <w:p>
+      <w:r>
+        <w:rPr>
+          <w:rFonts w:ascii="Aptos" w:eastAsia="Aptos" w:hAnsi="Aptos" w:cs="Aptos"/>
+        </w:rPr>
+        <w:t>If risk_triggered = false:</w:t>
       </w:r>
     </w:p>
     <w:p>
@@ -2961,19 +2740,11 @@
           <w:rFonts w:ascii="Aptos" w:eastAsia="Aptos" w:hAnsi="Aptos" w:cs="Aptos"/>
         </w:rPr>
       </w:pPr>
-      <w:proofErr w:type="spellStart"/>
-      <w:r>
-        <w:rPr>
-          <w:rFonts w:ascii="Aptos" w:eastAsia="Aptos" w:hAnsi="Aptos" w:cs="Aptos"/>
-        </w:rPr>
-        <w:t>escalation_only</w:t>
-      </w:r>
-      <w:proofErr w:type="spellEnd"/>
-      <w:r>
-        <w:rPr>
-          <w:rFonts w:ascii="Aptos" w:eastAsia="Aptos" w:hAnsi="Aptos" w:cs="Aptos"/>
-        </w:rPr>
-        <w:t xml:space="preserve"> MUST be null.</w:t>
+      <w:r>
+        <w:rPr>
+          <w:rFonts w:ascii="Aptos" w:eastAsia="Aptos" w:hAnsi="Aptos" w:cs="Aptos"/>
+        </w:rPr>
+        <w:t>escalation_only MUST be null.</w:t>
       </w:r>
     </w:p>
     <w:p>
@@ -2988,19 +2759,11 @@
           <w:rFonts w:ascii="Aptos" w:eastAsia="Aptos" w:hAnsi="Aptos" w:cs="Aptos"/>
         </w:rPr>
       </w:pPr>
-      <w:proofErr w:type="spellStart"/>
-      <w:r>
-        <w:rPr>
-          <w:rFonts w:ascii="Aptos" w:eastAsia="Aptos" w:hAnsi="Aptos" w:cs="Aptos"/>
-        </w:rPr>
-        <w:t>risk_name</w:t>
-      </w:r>
-      <w:proofErr w:type="spellEnd"/>
-      <w:r>
-        <w:rPr>
-          <w:rFonts w:ascii="Aptos" w:eastAsia="Aptos" w:hAnsi="Aptos" w:cs="Aptos"/>
-        </w:rPr>
-        <w:t xml:space="preserve"> MUST be null.</w:t>
+      <w:r>
+        <w:rPr>
+          <w:rFonts w:ascii="Aptos" w:eastAsia="Aptos" w:hAnsi="Aptos" w:cs="Aptos"/>
+        </w:rPr>
+        <w:t>risk_name MUST be null.</w:t>
       </w:r>
     </w:p>
     <w:p>
@@ -3015,19 +2778,11 @@
           <w:rFonts w:ascii="Aptos" w:eastAsia="Aptos" w:hAnsi="Aptos" w:cs="Aptos"/>
         </w:rPr>
       </w:pPr>
-      <w:proofErr w:type="spellStart"/>
-      <w:r>
-        <w:rPr>
-          <w:rFonts w:ascii="Aptos" w:eastAsia="Aptos" w:hAnsi="Aptos" w:cs="Aptos"/>
-        </w:rPr>
-        <w:t>risk_description</w:t>
-      </w:r>
-      <w:proofErr w:type="spellEnd"/>
-      <w:r>
-        <w:rPr>
-          <w:rFonts w:ascii="Aptos" w:eastAsia="Aptos" w:hAnsi="Aptos" w:cs="Aptos"/>
-        </w:rPr>
-        <w:t xml:space="preserve"> MUST be null</w:t>
+      <w:r>
+        <w:rPr>
+          <w:rFonts w:ascii="Aptos" w:eastAsia="Aptos" w:hAnsi="Aptos" w:cs="Aptos"/>
+        </w:rPr>
+        <w:t>risk_description MUST be null</w:t>
       </w:r>
     </w:p>
     <w:p>
@@ -3042,19 +2797,11 @@
           <w:rFonts w:ascii="Aptos" w:eastAsia="Aptos" w:hAnsi="Aptos" w:cs="Aptos"/>
         </w:rPr>
       </w:pPr>
-      <w:proofErr w:type="spellStart"/>
-      <w:r>
-        <w:rPr>
-          <w:rFonts w:ascii="Aptos" w:eastAsia="Aptos" w:hAnsi="Aptos" w:cs="Aptos"/>
-        </w:rPr>
-        <w:t>original_language</w:t>
-      </w:r>
-      <w:proofErr w:type="spellEnd"/>
-      <w:r>
-        <w:rPr>
-          <w:rFonts w:ascii="Aptos" w:eastAsia="Aptos" w:hAnsi="Aptos" w:cs="Aptos"/>
-        </w:rPr>
-        <w:t xml:space="preserve"> MUST be null.</w:t>
+      <w:r>
+        <w:rPr>
+          <w:rFonts w:ascii="Aptos" w:eastAsia="Aptos" w:hAnsi="Aptos" w:cs="Aptos"/>
+        </w:rPr>
+        <w:t>original_language MUST be null.</w:t>
       </w:r>
     </w:p>
     <w:p>
@@ -3069,19 +2816,11 @@
           <w:rFonts w:ascii="Aptos" w:eastAsia="Aptos" w:hAnsi="Aptos" w:cs="Aptos"/>
         </w:rPr>
       </w:pPr>
-      <w:proofErr w:type="spellStart"/>
-      <w:r>
-        <w:rPr>
-          <w:rFonts w:ascii="Aptos" w:eastAsia="Aptos" w:hAnsi="Aptos" w:cs="Aptos"/>
-        </w:rPr>
-        <w:t>reason_for_deletion</w:t>
-      </w:r>
-      <w:proofErr w:type="spellEnd"/>
-      <w:r>
-        <w:rPr>
-          <w:rFonts w:ascii="Aptos" w:eastAsia="Aptos" w:hAnsi="Aptos" w:cs="Aptos"/>
-        </w:rPr>
-        <w:t xml:space="preserve"> MUST be null.</w:t>
+      <w:r>
+        <w:rPr>
+          <w:rFonts w:ascii="Aptos" w:eastAsia="Aptos" w:hAnsi="Aptos" w:cs="Aptos"/>
+        </w:rPr>
+        <w:t>reason_for_deletion MUST be null.</w:t>
       </w:r>
     </w:p>
     <w:p>
@@ -3096,19 +2835,11 @@
           <w:rFonts w:ascii="Aptos" w:eastAsia="Aptos" w:hAnsi="Aptos" w:cs="Aptos"/>
         </w:rPr>
       </w:pPr>
-      <w:proofErr w:type="spellStart"/>
-      <w:r>
-        <w:rPr>
-          <w:rFonts w:ascii="Aptos" w:eastAsia="Aptos" w:hAnsi="Aptos" w:cs="Aptos"/>
-        </w:rPr>
-        <w:t>mitigating_language</w:t>
-      </w:r>
-      <w:proofErr w:type="spellEnd"/>
-      <w:r>
-        <w:rPr>
-          <w:rFonts w:ascii="Aptos" w:eastAsia="Aptos" w:hAnsi="Aptos" w:cs="Aptos"/>
-        </w:rPr>
-        <w:t xml:space="preserve"> MUST be null.</w:t>
+      <w:r>
+        <w:rPr>
+          <w:rFonts w:ascii="Aptos" w:eastAsia="Aptos" w:hAnsi="Aptos" w:cs="Aptos"/>
+        </w:rPr>
+        <w:t>mitigating_language MUST be null.</w:t>
       </w:r>
     </w:p>
     <w:p>
@@ -3123,19 +2854,11 @@
           <w:rFonts w:ascii="Aptos" w:eastAsia="Aptos" w:hAnsi="Aptos" w:cs="Aptos"/>
         </w:rPr>
       </w:pPr>
-      <w:proofErr w:type="spellStart"/>
-      <w:r>
-        <w:rPr>
-          <w:rFonts w:ascii="Aptos" w:eastAsia="Aptos" w:hAnsi="Aptos" w:cs="Aptos"/>
-        </w:rPr>
-        <w:t>clean_nda_fragment</w:t>
-      </w:r>
-      <w:proofErr w:type="spellEnd"/>
-      <w:r>
-        <w:rPr>
-          <w:rFonts w:ascii="Aptos" w:eastAsia="Aptos" w:hAnsi="Aptos" w:cs="Aptos"/>
-        </w:rPr>
-        <w:t xml:space="preserve"> MUST be null.</w:t>
+      <w:r>
+        <w:rPr>
+          <w:rFonts w:ascii="Aptos" w:eastAsia="Aptos" w:hAnsi="Aptos" w:cs="Aptos"/>
+        </w:rPr>
+        <w:t>clean_nda_fragment MUST be null.</w:t>
       </w:r>
     </w:p>
     <w:p>
@@ -3153,21 +2876,7 @@
         <w:rPr>
           <w:rFonts w:ascii="Aptos" w:eastAsia="Aptos" w:hAnsi="Aptos" w:cs="Aptos"/>
         </w:rPr>
-        <w:t xml:space="preserve">If </w:t>
-      </w:r>
-      <w:proofErr w:type="spellStart"/>
-      <w:r>
-        <w:rPr>
-          <w:rFonts w:ascii="Aptos" w:eastAsia="Aptos" w:hAnsi="Aptos" w:cs="Aptos"/>
-        </w:rPr>
-        <w:t>risk_triggered</w:t>
-      </w:r>
-      <w:proofErr w:type="spellEnd"/>
-      <w:r>
-        <w:rPr>
-          <w:rFonts w:ascii="Aptos" w:eastAsia="Aptos" w:hAnsi="Aptos" w:cs="Aptos"/>
-        </w:rPr>
-        <w:t xml:space="preserve"> = true:</w:t>
+        <w:t>If risk_triggered = true:</w:t>
       </w:r>
     </w:p>
     <w:p>
@@ -3182,19 +2891,11 @@
           <w:rFonts w:ascii="Aptos" w:eastAsia="Aptos" w:hAnsi="Aptos" w:cs="Aptos"/>
         </w:rPr>
       </w:pPr>
-      <w:proofErr w:type="spellStart"/>
-      <w:r>
-        <w:rPr>
-          <w:rFonts w:ascii="Aptos" w:eastAsia="Aptos" w:hAnsi="Aptos" w:cs="Aptos"/>
-        </w:rPr>
-        <w:t>escalation_only</w:t>
-      </w:r>
-      <w:proofErr w:type="spellEnd"/>
-      <w:r>
-        <w:rPr>
-          <w:rFonts w:ascii="Aptos" w:eastAsia="Aptos" w:hAnsi="Aptos" w:cs="Aptos"/>
-        </w:rPr>
-        <w:t xml:space="preserve"> MUST be true.</w:t>
+      <w:r>
+        <w:rPr>
+          <w:rFonts w:ascii="Aptos" w:eastAsia="Aptos" w:hAnsi="Aptos" w:cs="Aptos"/>
+        </w:rPr>
+        <w:t>escalation_only MUST be true.</w:t>
       </w:r>
     </w:p>
     <w:p>
@@ -3209,19 +2910,11 @@
           <w:rFonts w:ascii="Aptos" w:eastAsia="Aptos" w:hAnsi="Aptos" w:cs="Aptos"/>
         </w:rPr>
       </w:pPr>
-      <w:proofErr w:type="spellStart"/>
-      <w:r>
-        <w:rPr>
-          <w:rFonts w:ascii="Aptos" w:eastAsia="Aptos" w:hAnsi="Aptos" w:cs="Aptos"/>
-        </w:rPr>
-        <w:t>risk_name</w:t>
-      </w:r>
-      <w:proofErr w:type="spellEnd"/>
-      <w:r>
-        <w:rPr>
-          <w:rFonts w:ascii="Aptos" w:eastAsia="Aptos" w:hAnsi="Aptos" w:cs="Aptos"/>
-        </w:rPr>
-        <w:t xml:space="preserve"> MUST be "Individual NDA".</w:t>
+      <w:r>
+        <w:rPr>
+          <w:rFonts w:ascii="Aptos" w:eastAsia="Aptos" w:hAnsi="Aptos" w:cs="Aptos"/>
+        </w:rPr>
+        <w:t>risk_name MUST be "Individual NDA".</w:t>
       </w:r>
     </w:p>
     <w:p>
@@ -3233,13 +2926,8 @@
         <w:spacing w:after="0"/>
         <w:contextualSpacing/>
       </w:pPr>
-      <w:proofErr w:type="spellStart"/>
-      <w:r>
-        <w:t>risk_description</w:t>
-      </w:r>
-      <w:proofErr w:type="spellEnd"/>
-      <w:r>
-        <w:t xml:space="preserve"> MUST use only the Static Individual NDA Risk Description from the Knowledge Base.</w:t>
+      <w:r>
+        <w:t>risk_description MUST use only the Static Individual NDA Risk Description from the Knowledge Base.</w:t>
       </w:r>
     </w:p>
     <w:p>
@@ -3250,13 +2938,8 @@
         </w:numPr>
         <w:contextualSpacing/>
       </w:pPr>
-      <w:proofErr w:type="spellStart"/>
-      <w:r>
-        <w:t>mitigating_language</w:t>
-      </w:r>
-      <w:proofErr w:type="spellEnd"/>
-      <w:r>
-        <w:t xml:space="preserve"> MUST use only the Individual NDA Mitigation Language from the Knowledge Base.</w:t>
+      <w:r>
+        <w:t>mitigating_language MUST use only the Individual NDA Mitigation Language from the Knowledge Base.</w:t>
       </w:r>
     </w:p>
     <w:p>
@@ -3271,19 +2954,11 @@
           <w:rFonts w:ascii="Aptos" w:eastAsia="Aptos" w:hAnsi="Aptos" w:cs="Aptos"/>
         </w:rPr>
       </w:pPr>
-      <w:proofErr w:type="spellStart"/>
-      <w:r>
-        <w:rPr>
-          <w:rFonts w:ascii="Aptos" w:eastAsia="Aptos" w:hAnsi="Aptos" w:cs="Aptos"/>
-        </w:rPr>
-        <w:t>clean_nda_fragment</w:t>
-      </w:r>
-      <w:proofErr w:type="spellEnd"/>
-      <w:r>
-        <w:rPr>
-          <w:rFonts w:ascii="Aptos" w:eastAsia="Aptos" w:hAnsi="Aptos" w:cs="Aptos"/>
-        </w:rPr>
-        <w:t xml:space="preserve"> MUST be null.</w:t>
+      <w:r>
+        <w:rPr>
+          <w:rFonts w:ascii="Aptos" w:eastAsia="Aptos" w:hAnsi="Aptos" w:cs="Aptos"/>
+        </w:rPr>
+        <w:t>clean_nda_fragment MUST be null.</w:t>
       </w:r>
     </w:p>
     <w:p>
@@ -3301,21 +2976,7 @@
         <w:rPr>
           <w:rFonts w:ascii="Aptos" w:eastAsia="Aptos" w:hAnsi="Aptos" w:cs="Aptos"/>
         </w:rPr>
-        <w:t xml:space="preserve">Extract ONLY exact NDA clause text for </w:t>
-      </w:r>
-      <w:proofErr w:type="spellStart"/>
-      <w:r>
-        <w:rPr>
-          <w:rFonts w:ascii="Aptos" w:eastAsia="Aptos" w:hAnsi="Aptos" w:cs="Aptos"/>
-        </w:rPr>
-        <w:t>original_language</w:t>
-      </w:r>
-      <w:proofErr w:type="spellEnd"/>
-      <w:r>
-        <w:rPr>
-          <w:rFonts w:ascii="Aptos" w:eastAsia="Aptos" w:hAnsi="Aptos" w:cs="Aptos"/>
-        </w:rPr>
-        <w:t>.</w:t>
+        <w:t>Extract ONLY exact NDA clause text for original_language.</w:t>
       </w:r>
     </w:p>
     <w:p>
@@ -3374,19 +3035,11 @@
           <w:rFonts w:ascii="Aptos" w:eastAsia="Aptos" w:hAnsi="Aptos" w:cs="Aptos"/>
         </w:rPr>
       </w:pPr>
-      <w:proofErr w:type="gramStart"/>
-      <w:r>
-        <w:rPr>
-          <w:rFonts w:ascii="Aptos" w:eastAsia="Aptos" w:hAnsi="Aptos" w:cs="Aptos"/>
-        </w:rPr>
-        <w:t>all</w:t>
-      </w:r>
-      <w:proofErr w:type="gramEnd"/>
-      <w:r>
-        <w:rPr>
-          <w:rFonts w:ascii="Aptos" w:eastAsia="Aptos" w:hAnsi="Aptos" w:cs="Aptos"/>
-        </w:rPr>
-        <w:t xml:space="preserve"> other fields MUST be null.</w:t>
+      <w:r>
+        <w:rPr>
+          <w:rFonts w:ascii="Aptos" w:eastAsia="Aptos" w:hAnsi="Aptos" w:cs="Aptos"/>
+        </w:rPr>
+        <w:t>all other fields MUST be null.</w:t>
       </w:r>
     </w:p>
     <w:p/>

</xml_diff>